<commit_message>
added few topics in array practical
</commit_message>
<xml_diff>
--- a/TheorynCoding/Study Material/Java Overall/Java Overall/Important Notes.docx
+++ b/TheorynCoding/Study Material/Java Overall/Java Overall/Important Notes.docx
@@ -112,6 +112,7 @@
           <w:lang w:eastAsia="en-IN"/>
         </w:rPr>
       </w:pPr>
+      <w:proofErr w:type="gramStart"/>
       <w:r>
         <w:rPr>
           <w:rFonts w:ascii="Courier New" w:eastAsia="Times New Roman" w:hAnsi="Courier New" w:cs="Courier New"/>
@@ -119,8 +120,365 @@
           <w:szCs w:val="20"/>
           <w:lang w:eastAsia="en-IN"/>
         </w:rPr>
-        <w:t>O(1)</w:t>
+        <w:t>O(</w:t>
       </w:r>
+      <w:proofErr w:type="gramEnd"/>
+      <w:r>
+        <w:rPr>
+          <w:rFonts w:ascii="Courier New" w:eastAsia="Times New Roman" w:hAnsi="Courier New" w:cs="Courier New"/>
+          <w:sz w:val="20"/>
+          <w:szCs w:val="20"/>
+          <w:lang w:eastAsia="en-IN"/>
+        </w:rPr>
+        <w:t>1)</w:t>
+      </w:r>
+    </w:p>
+    <w:p>
+      <w:pPr>
+        <w:tabs>
+          <w:tab w:val="left" w:pos="916"/>
+          <w:tab w:val="left" w:pos="1832"/>
+          <w:tab w:val="left" w:pos="2748"/>
+          <w:tab w:val="left" w:pos="3664"/>
+          <w:tab w:val="left" w:pos="4580"/>
+          <w:tab w:val="left" w:pos="5496"/>
+          <w:tab w:val="left" w:pos="6412"/>
+          <w:tab w:val="left" w:pos="7328"/>
+          <w:tab w:val="left" w:pos="8244"/>
+          <w:tab w:val="left" w:pos="9160"/>
+          <w:tab w:val="left" w:pos="10076"/>
+          <w:tab w:val="left" w:pos="10992"/>
+          <w:tab w:val="left" w:pos="11908"/>
+          <w:tab w:val="left" w:pos="12824"/>
+          <w:tab w:val="left" w:pos="13740"/>
+          <w:tab w:val="left" w:pos="14656"/>
+        </w:tabs>
+        <w:spacing w:after="0" w:line="240" w:lineRule="auto"/>
+        <w:rPr>
+          <w:rFonts w:ascii="Courier New" w:eastAsia="Times New Roman" w:hAnsi="Courier New" w:cs="Courier New"/>
+          <w:sz w:val="20"/>
+          <w:szCs w:val="20"/>
+          <w:lang w:eastAsia="en-IN"/>
+        </w:rPr>
+      </w:pPr>
+    </w:p>
+    <w:tbl>
+      <w:tblPr>
+        <w:tblW w:w="0" w:type="auto"/>
+        <w:tblCellSpacing w:w="15" w:type="dxa"/>
+        <w:tblBorders>
+          <w:top w:val="single" w:sz="4" w:space="0" w:color="auto"/>
+          <w:left w:val="single" w:sz="4" w:space="0" w:color="auto"/>
+          <w:bottom w:val="single" w:sz="4" w:space="0" w:color="auto"/>
+          <w:right w:val="single" w:sz="4" w:space="0" w:color="auto"/>
+          <w:insideH w:val="single" w:sz="4" w:space="0" w:color="auto"/>
+          <w:insideV w:val="single" w:sz="4" w:space="0" w:color="auto"/>
+        </w:tblBorders>
+        <w:tblCellMar>
+          <w:top w:w="15" w:type="dxa"/>
+          <w:left w:w="15" w:type="dxa"/>
+          <w:bottom w:w="15" w:type="dxa"/>
+          <w:right w:w="15" w:type="dxa"/>
+        </w:tblCellMar>
+        <w:tblLook w:val="04A0" w:firstRow="1" w:lastRow="0" w:firstColumn="1" w:lastColumn="0" w:noHBand="0" w:noVBand="1"/>
+      </w:tblPr>
+      <w:tblGrid>
+        <w:gridCol w:w="2063"/>
+        <w:gridCol w:w="4960"/>
+      </w:tblGrid>
+      <w:tr>
+        <w:trPr>
+          <w:tblHeader/>
+          <w:tblCellSpacing w:w="15" w:type="dxa"/>
+        </w:trPr>
+        <w:tc>
+          <w:tcPr>
+            <w:tcW w:w="0" w:type="auto"/>
+            <w:vAlign w:val="center"/>
+            <w:hideMark/>
+          </w:tcPr>
+          <w:p>
+            <w:pPr>
+              <w:spacing w:after="0" w:line="240" w:lineRule="auto"/>
+              <w:jc w:val="center"/>
+              <w:rPr>
+                <w:rFonts w:ascii="Times New Roman" w:eastAsia="Times New Roman" w:hAnsi="Times New Roman" w:cs="Times New Roman"/>
+                <w:b/>
+                <w:bCs/>
+                <w:sz w:val="24"/>
+                <w:szCs w:val="24"/>
+                <w:lang w:eastAsia="en-IN"/>
+              </w:rPr>
+            </w:pPr>
+            <w:r>
+              <w:rPr>
+                <w:rFonts w:ascii="Times New Roman" w:eastAsia="Times New Roman" w:hAnsi="Times New Roman" w:cs="Times New Roman"/>
+                <w:b/>
+                <w:bCs/>
+                <w:sz w:val="24"/>
+                <w:szCs w:val="24"/>
+                <w:lang w:eastAsia="en-IN"/>
+              </w:rPr>
+              <w:t>Data Structure</w:t>
+            </w:r>
+          </w:p>
+        </w:tc>
+        <w:tc>
+          <w:tcPr>
+            <w:tcW w:w="0" w:type="auto"/>
+            <w:vAlign w:val="center"/>
+            <w:hideMark/>
+          </w:tcPr>
+          <w:p>
+            <w:pPr>
+              <w:spacing w:after="0" w:line="240" w:lineRule="auto"/>
+              <w:jc w:val="center"/>
+              <w:rPr>
+                <w:rFonts w:ascii="Times New Roman" w:eastAsia="Times New Roman" w:hAnsi="Times New Roman" w:cs="Times New Roman"/>
+                <w:b/>
+                <w:bCs/>
+                <w:sz w:val="24"/>
+                <w:szCs w:val="24"/>
+                <w:lang w:eastAsia="en-IN"/>
+              </w:rPr>
+            </w:pPr>
+            <w:r>
+              <w:rPr>
+                <w:rFonts w:ascii="Times New Roman" w:eastAsia="Times New Roman" w:hAnsi="Times New Roman" w:cs="Times New Roman"/>
+                <w:b/>
+                <w:bCs/>
+                <w:sz w:val="24"/>
+                <w:szCs w:val="24"/>
+                <w:lang w:eastAsia="en-IN"/>
+              </w:rPr>
+              <w:t>How O(1) search works</w:t>
+            </w:r>
+          </w:p>
+        </w:tc>
+      </w:tr>
+      <w:tr>
+        <w:trPr>
+          <w:tblCellSpacing w:w="15" w:type="dxa"/>
+        </w:trPr>
+        <w:tc>
+          <w:tcPr>
+            <w:tcW w:w="0" w:type="auto"/>
+            <w:vAlign w:val="center"/>
+            <w:hideMark/>
+          </w:tcPr>
+          <w:p>
+            <w:pPr>
+              <w:spacing w:after="0" w:line="240" w:lineRule="auto"/>
+              <w:rPr>
+                <w:rFonts w:ascii="Times New Roman" w:eastAsia="Times New Roman" w:hAnsi="Times New Roman" w:cs="Times New Roman"/>
+                <w:sz w:val="24"/>
+                <w:szCs w:val="24"/>
+                <w:lang w:eastAsia="en-IN"/>
+              </w:rPr>
+            </w:pPr>
+            <w:r>
+              <w:rPr>
+                <w:rFonts w:ascii="Times New Roman" w:eastAsia="Times New Roman" w:hAnsi="Times New Roman" w:cs="Times New Roman"/>
+                <w:b/>
+                <w:bCs/>
+                <w:sz w:val="24"/>
+                <w:szCs w:val="24"/>
+                <w:lang w:eastAsia="en-IN"/>
+              </w:rPr>
+              <w:t>Array (by index)</w:t>
+            </w:r>
+          </w:p>
+        </w:tc>
+        <w:tc>
+          <w:tcPr>
+            <w:tcW w:w="0" w:type="auto"/>
+            <w:vAlign w:val="center"/>
+            <w:hideMark/>
+          </w:tcPr>
+          <w:p>
+            <w:pPr>
+              <w:spacing w:after="0" w:line="240" w:lineRule="auto"/>
+              <w:rPr>
+                <w:rFonts w:ascii="Times New Roman" w:eastAsia="Times New Roman" w:hAnsi="Times New Roman" w:cs="Times New Roman"/>
+                <w:sz w:val="24"/>
+                <w:szCs w:val="24"/>
+                <w:lang w:eastAsia="en-IN"/>
+              </w:rPr>
+            </w:pPr>
+            <w:r>
+              <w:rPr>
+                <w:rFonts w:ascii="Times New Roman" w:eastAsia="Times New Roman" w:hAnsi="Times New Roman" w:cs="Times New Roman"/>
+                <w:sz w:val="24"/>
+                <w:szCs w:val="24"/>
+                <w:lang w:eastAsia="en-IN"/>
+              </w:rPr>
+              <w:t>You know the index → compute address → fetch value</w:t>
+            </w:r>
+          </w:p>
+        </w:tc>
+      </w:tr>
+      <w:tr>
+        <w:trPr>
+          <w:tblCellSpacing w:w="15" w:type="dxa"/>
+        </w:trPr>
+        <w:tc>
+          <w:tcPr>
+            <w:tcW w:w="0" w:type="auto"/>
+            <w:vAlign w:val="center"/>
+            <w:hideMark/>
+          </w:tcPr>
+          <w:p>
+            <w:pPr>
+              <w:spacing w:after="0" w:line="240" w:lineRule="auto"/>
+              <w:rPr>
+                <w:rFonts w:ascii="Times New Roman" w:eastAsia="Times New Roman" w:hAnsi="Times New Roman" w:cs="Times New Roman"/>
+                <w:sz w:val="24"/>
+                <w:szCs w:val="24"/>
+                <w:lang w:eastAsia="en-IN"/>
+              </w:rPr>
+            </w:pPr>
+            <w:r>
+              <w:rPr>
+                <w:rFonts w:ascii="Times New Roman" w:eastAsia="Times New Roman" w:hAnsi="Times New Roman" w:cs="Times New Roman"/>
+                <w:b/>
+                <w:bCs/>
+                <w:sz w:val="24"/>
+                <w:szCs w:val="24"/>
+                <w:lang w:eastAsia="en-IN"/>
+              </w:rPr>
+              <w:t>Hash Table / Hash Map</w:t>
+            </w:r>
+          </w:p>
+        </w:tc>
+        <w:tc>
+          <w:tcPr>
+            <w:tcW w:w="0" w:type="auto"/>
+            <w:vAlign w:val="center"/>
+            <w:hideMark/>
+          </w:tcPr>
+          <w:p>
+            <w:pPr>
+              <w:spacing w:after="0" w:line="240" w:lineRule="auto"/>
+              <w:rPr>
+                <w:rFonts w:ascii="Times New Roman" w:eastAsia="Times New Roman" w:hAnsi="Times New Roman" w:cs="Times New Roman"/>
+                <w:sz w:val="24"/>
+                <w:szCs w:val="24"/>
+                <w:lang w:eastAsia="en-IN"/>
+              </w:rPr>
+            </w:pPr>
+            <w:r>
+              <w:rPr>
+                <w:rFonts w:ascii="Times New Roman" w:eastAsia="Times New Roman" w:hAnsi="Times New Roman" w:cs="Times New Roman"/>
+                <w:sz w:val="24"/>
+                <w:szCs w:val="24"/>
+                <w:lang w:eastAsia="en-IN"/>
+              </w:rPr>
+              <w:t>You know the key → hash function gives exact location</w:t>
+            </w:r>
+            <w:bookmarkStart w:id="0" w:name="_GoBack"/>
+            <w:bookmarkEnd w:id="0"/>
+            <w:r>
+              <w:rPr>
+                <w:rFonts w:ascii="Times New Roman" w:eastAsia="Times New Roman" w:hAnsi="Times New Roman" w:cs="Times New Roman"/>
+                <w:sz w:val="24"/>
+                <w:szCs w:val="24"/>
+                <w:lang w:eastAsia="en-IN"/>
+              </w:rPr>
+              <w:t xml:space="preserve"> → fetch value</w:t>
+            </w:r>
+          </w:p>
+        </w:tc>
+      </w:tr>
+      <w:tr>
+        <w:trPr>
+          <w:tblCellSpacing w:w="15" w:type="dxa"/>
+        </w:trPr>
+        <w:tc>
+          <w:tcPr>
+            <w:tcW w:w="0" w:type="auto"/>
+            <w:vAlign w:val="center"/>
+            <w:hideMark/>
+          </w:tcPr>
+          <w:p>
+            <w:pPr>
+              <w:spacing w:after="0" w:line="240" w:lineRule="auto"/>
+              <w:rPr>
+                <w:rFonts w:ascii="Times New Roman" w:eastAsia="Times New Roman" w:hAnsi="Times New Roman" w:cs="Times New Roman"/>
+                <w:sz w:val="24"/>
+                <w:szCs w:val="24"/>
+                <w:lang w:eastAsia="en-IN"/>
+              </w:rPr>
+            </w:pPr>
+            <w:r>
+              <w:rPr>
+                <w:rFonts w:ascii="Times New Roman" w:eastAsia="Times New Roman" w:hAnsi="Times New Roman" w:cs="Times New Roman"/>
+                <w:b/>
+                <w:bCs/>
+                <w:sz w:val="24"/>
+                <w:szCs w:val="24"/>
+                <w:lang w:eastAsia="en-IN"/>
+              </w:rPr>
+              <w:t>Direct Access Table</w:t>
+            </w:r>
+          </w:p>
+        </w:tc>
+        <w:tc>
+          <w:tcPr>
+            <w:tcW w:w="0" w:type="auto"/>
+            <w:vAlign w:val="center"/>
+            <w:hideMark/>
+          </w:tcPr>
+          <w:p>
+            <w:pPr>
+              <w:spacing w:after="0" w:line="240" w:lineRule="auto"/>
+              <w:rPr>
+                <w:rFonts w:ascii="Times New Roman" w:eastAsia="Times New Roman" w:hAnsi="Times New Roman" w:cs="Times New Roman"/>
+                <w:sz w:val="24"/>
+                <w:szCs w:val="24"/>
+                <w:lang w:eastAsia="en-IN"/>
+              </w:rPr>
+            </w:pPr>
+            <w:r>
+              <w:rPr>
+                <w:rFonts w:ascii="Times New Roman" w:eastAsia="Times New Roman" w:hAnsi="Times New Roman" w:cs="Times New Roman"/>
+                <w:sz w:val="24"/>
+                <w:szCs w:val="24"/>
+                <w:lang w:eastAsia="en-IN"/>
+              </w:rPr>
+              <w:t>Each key maps directly to a memory slot → instant fetch</w:t>
+            </w:r>
+          </w:p>
+        </w:tc>
+      </w:tr>
+    </w:tbl>
+    <w:p>
+      <w:pPr>
+        <w:tabs>
+          <w:tab w:val="left" w:pos="916"/>
+          <w:tab w:val="left" w:pos="1832"/>
+          <w:tab w:val="left" w:pos="2748"/>
+          <w:tab w:val="left" w:pos="3664"/>
+          <w:tab w:val="left" w:pos="4580"/>
+          <w:tab w:val="left" w:pos="5496"/>
+          <w:tab w:val="left" w:pos="6412"/>
+          <w:tab w:val="left" w:pos="7328"/>
+          <w:tab w:val="left" w:pos="8244"/>
+          <w:tab w:val="left" w:pos="9160"/>
+          <w:tab w:val="left" w:pos="10076"/>
+          <w:tab w:val="left" w:pos="10992"/>
+          <w:tab w:val="left" w:pos="11908"/>
+          <w:tab w:val="left" w:pos="12824"/>
+          <w:tab w:val="left" w:pos="13740"/>
+          <w:tab w:val="left" w:pos="14656"/>
+        </w:tabs>
+        <w:spacing w:after="0" w:line="240" w:lineRule="auto"/>
+        <w:rPr>
+          <w:rFonts w:ascii="Courier New" w:eastAsia="Times New Roman" w:hAnsi="Courier New" w:cs="Courier New"/>
+          <w:sz w:val="20"/>
+          <w:szCs w:val="20"/>
+          <w:lang w:eastAsia="en-IN"/>
+        </w:rPr>
+      </w:pPr>
     </w:p>
     <w:p>
       <w:pPr>
@@ -131,8 +489,6 @@
           <w:lang w:eastAsia="en-IN"/>
         </w:rPr>
       </w:pPr>
-      <w:bookmarkStart w:id="0" w:name="_GoBack"/>
-      <w:bookmarkEnd w:id="0"/>
     </w:p>
     <w:p/>
     <w:sectPr>
@@ -671,6 +1027,17 @@
       <w:szCs w:val="20"/>
     </w:rPr>
   </w:style>
+  <w:style w:type="character" w:styleId="Strong">
+    <w:name w:val="Strong"/>
+    <w:basedOn w:val="DefaultParagraphFont"/>
+    <w:uiPriority w:val="22"/>
+    <w:qFormat/>
+    <w:rsid w:val="00050CD6"/>
+    <w:rPr>
+      <w:b/>
+      <w:bCs/>
+    </w:rPr>
+  </w:style>
 </w:styles>
 </file>
 
@@ -985,6 +1352,17 @@
       <w:rFonts w:ascii="Courier New" w:eastAsia="Times New Roman" w:hAnsi="Courier New" w:cs="Courier New"/>
       <w:sz w:val="20"/>
       <w:szCs w:val="20"/>
+    </w:rPr>
+  </w:style>
+  <w:style w:type="character" w:styleId="Strong">
+    <w:name w:val="Strong"/>
+    <w:basedOn w:val="DefaultParagraphFont"/>
+    <w:uiPriority w:val="22"/>
+    <w:qFormat/>
+    <w:rsid w:val="00050CD6"/>
+    <w:rPr>
+      <w:b/>
+      <w:bCs/>
     </w:rPr>
   </w:style>
 </w:styles>

</xml_diff>

<commit_message>
started advance java notes
</commit_message>
<xml_diff>
--- a/TheorynCoding/Study Material/Java Overall/Java Overall/Important Notes.docx
+++ b/TheorynCoding/Study Material/Java Overall/Java Overall/Important Notes.docx
@@ -1759,91 +1759,533 @@
         <w:t>1)</w:t>
       </w:r>
     </w:p>
+    <w:p/>
     <w:p>
-      <w:bookmarkStart w:id="0" w:name="_GoBack"/>
-      <w:bookmarkEnd w:id="0"/>
+      <w:proofErr w:type="spellStart"/>
+      <w:r>
+        <w:rPr>
+          <w:highlight w:val="yellow"/>
+        </w:rPr>
+        <w:t>Travesal</w:t>
+      </w:r>
+      <w:proofErr w:type="spellEnd"/>
+    </w:p>
+    <w:p>
+      <w:pPr>
+        <w:pStyle w:val="NormalWeb"/>
+      </w:pPr>
+      <w:r>
+        <w:t xml:space="preserve">Index: </w:t>
+      </w:r>
+      <w:r>
+        <w:rPr>
+          <w:rStyle w:val="HTMLCode"/>
+        </w:rPr>
+        <w:t>0 → 1 → 2 → 3 → ... → n-1</w:t>
+      </w:r>
+      <w:r>
+        <w:br/>
+      </w:r>
+      <w:proofErr w:type="gramStart"/>
+      <w:r>
+        <w:t>You</w:t>
+      </w:r>
+      <w:proofErr w:type="gramEnd"/>
+      <w:r>
+        <w:t xml:space="preserve"> perform one operation per element → total = </w:t>
+      </w:r>
+      <w:r>
+        <w:rPr>
+          <w:rStyle w:val="Strong"/>
+        </w:rPr>
+        <w:t>n operations</w:t>
+      </w:r>
+    </w:p>
+    <w:p>
+      <w:pPr>
+        <w:pStyle w:val="Heading3"/>
+      </w:pPr>
+      <w:r>
+        <w:t>Final Answer:</w:t>
+      </w:r>
+    </w:p>
+    <w:p>
+      <w:pPr>
+        <w:pStyle w:val="NormalWeb"/>
+      </w:pPr>
+      <w:r>
+        <w:t xml:space="preserve">👉 </w:t>
+      </w:r>
+      <w:r>
+        <w:rPr>
+          <w:rStyle w:val="Strong"/>
+        </w:rPr>
+        <w:t xml:space="preserve">Traversal = </w:t>
+      </w:r>
+      <w:proofErr w:type="gramStart"/>
+      <w:r>
+        <w:rPr>
+          <w:rStyle w:val="Strong"/>
+        </w:rPr>
+        <w:t>O(</w:t>
+      </w:r>
+      <w:proofErr w:type="gramEnd"/>
+      <w:r>
+        <w:rPr>
+          <w:rStyle w:val="Strong"/>
+        </w:rPr>
+        <w:t>n)</w:t>
+      </w:r>
+      <w:r>
+        <w:t xml:space="preserve"> (linear time complexity)</w:t>
+      </w:r>
+    </w:p>
+    <w:p/>
+    <w:p>
+      <w:r>
+        <w:rPr>
+          <w:highlight w:val="yellow"/>
+        </w:rPr>
+        <w:t>Spring</w:t>
+      </w:r>
+      <w:r>
+        <w:t xml:space="preserve"> </w:t>
+      </w:r>
     </w:p>
     <w:p>
       <w:proofErr w:type="spellStart"/>
-      <w:r>
-        <w:rPr>
-          <w:highlight w:val="yellow"/>
-        </w:rPr>
-        <w:t>Travesal</w:t>
+      <w:proofErr w:type="gramStart"/>
+      <w:r>
+        <w:t>IoC</w:t>
       </w:r>
       <w:proofErr w:type="spellEnd"/>
+      <w:proofErr w:type="gramEnd"/>
+      <w:r>
+        <w:t xml:space="preserve"> = Spring controls objects, DI = Spring connects objects, </w:t>
+      </w:r>
+      <w:proofErr w:type="spellStart"/>
+      <w:r>
+        <w:t>IoC</w:t>
+      </w:r>
+      <w:proofErr w:type="spellEnd"/>
+      <w:r>
+        <w:t xml:space="preserve"> Container = system that does both, @Component = auto creation, @Bean = manual creation, Spring Boot = auto-starts everything.</w:t>
+      </w:r>
     </w:p>
     <w:p>
       <w:pPr>
-        <w:pStyle w:val="NormalWeb"/>
-      </w:pPr>
-      <w:r>
-        <w:t xml:space="preserve">Index: </w:t>
-      </w:r>
-      <w:r>
-        <w:rPr>
-          <w:rStyle w:val="HTMLCode"/>
-        </w:rPr>
-        <w:t>0 → 1 → 2 → 3 → ... → n-1</w:t>
-      </w:r>
-      <w:r>
-        <w:br/>
-      </w:r>
-      <w:proofErr w:type="gramStart"/>
-      <w:r>
-        <w:t>You</w:t>
-      </w:r>
-      <w:proofErr w:type="gramEnd"/>
-      <w:r>
-        <w:t xml:space="preserve"> perform one operation per element → total = </w:t>
-      </w:r>
-      <w:r>
-        <w:rPr>
-          <w:rStyle w:val="Strong"/>
-        </w:rPr>
-        <w:t>n operations</w:t>
+        <w:pStyle w:val="Heading1"/>
+      </w:pPr>
+      <w:r>
+        <w:t>Spring Boot FLOW (COMPLETE + CORRECT)</w:t>
       </w:r>
     </w:p>
     <w:p>
       <w:pPr>
-        <w:pStyle w:val="Heading3"/>
-      </w:pPr>
-      <w:r>
-        <w:t>Final Answer:</w:t>
+        <w:pStyle w:val="HTMLPreformatted"/>
+        <w:shd w:val="clear" w:color="auto" w:fill="DDD9C3" w:themeFill="background2" w:themeFillShade="E6"/>
+      </w:pPr>
+      <w:r>
+        <w:rPr>
+          <w:rStyle w:val="HTMLCode"/>
+        </w:rPr>
+        <w:t xml:space="preserve">1. </w:t>
+      </w:r>
+      <w:proofErr w:type="spellStart"/>
+      <w:r>
+        <w:rPr>
+          <w:rStyle w:val="HTMLCode"/>
+        </w:rPr>
+        <w:t>IoC</w:t>
+      </w:r>
+      <w:proofErr w:type="spellEnd"/>
+      <w:r>
+        <w:rPr>
+          <w:rStyle w:val="HTMLCode"/>
+        </w:rPr>
+        <w:t xml:space="preserve"> (PRINCIPLE)</w:t>
+      </w:r>
+      <w:r>
+        <w:br/>
+      </w:r>
+      <w:r>
+        <w:rPr>
+          <w:rStyle w:val="HTMLCode"/>
+        </w:rPr>
+        <w:t xml:space="preserve">   → Rule: Spring should control object creation</w:t>
+      </w:r>
+      <w:bookmarkStart w:id="0" w:name="_GoBack"/>
+      <w:bookmarkEnd w:id="0"/>
+      <w:r>
+        <w:br/>
+      </w:r>
+      <w:r>
+        <w:rPr>
+          <w:rStyle w:val="HTMLCode"/>
+        </w:rPr>
+        <w:t xml:space="preserve">        ↓</w:t>
+      </w:r>
+      <w:r>
+        <w:br/>
+      </w:r>
+      <w:r>
+        <w:br/>
+      </w:r>
+      <w:r>
+        <w:rPr>
+          <w:rStyle w:val="HTMLCode"/>
+        </w:rPr>
+        <w:t>2. SPRING BOOT STARTS</w:t>
+      </w:r>
+      <w:r>
+        <w:br/>
+      </w:r>
+      <w:r>
+        <w:rPr>
+          <w:rStyle w:val="HTMLCode"/>
+        </w:rPr>
+        <w:lastRenderedPageBreak/>
+        <w:t xml:space="preserve">   → </w:t>
+      </w:r>
+      <w:proofErr w:type="spellStart"/>
+      <w:proofErr w:type="gramStart"/>
+      <w:r>
+        <w:rPr>
+          <w:rStyle w:val="HTMLCode"/>
+        </w:rPr>
+        <w:t>SpringApplication.run</w:t>
+      </w:r>
+      <w:proofErr w:type="spellEnd"/>
+      <w:r>
+        <w:rPr>
+          <w:rStyle w:val="HTMLCode"/>
+        </w:rPr>
+        <w:t>(</w:t>
+      </w:r>
+      <w:proofErr w:type="spellStart"/>
+      <w:proofErr w:type="gramEnd"/>
+      <w:r>
+        <w:rPr>
+          <w:rStyle w:val="HTMLCode"/>
+        </w:rPr>
+        <w:t>App.class</w:t>
+      </w:r>
+      <w:proofErr w:type="spellEnd"/>
+      <w:r>
+        <w:rPr>
+          <w:rStyle w:val="HTMLCode"/>
+        </w:rPr>
+        <w:t>, args)</w:t>
+      </w:r>
+      <w:r>
+        <w:br/>
+      </w:r>
+      <w:r>
+        <w:rPr>
+          <w:rStyle w:val="HTMLCode"/>
+        </w:rPr>
+        <w:t xml:space="preserve">   → Initializes </w:t>
+      </w:r>
+      <w:proofErr w:type="spellStart"/>
+      <w:r>
+        <w:rPr>
+          <w:rStyle w:val="HTMLCode"/>
+        </w:rPr>
+        <w:t>IoC</w:t>
+      </w:r>
+      <w:proofErr w:type="spellEnd"/>
+      <w:r>
+        <w:rPr>
+          <w:rStyle w:val="HTMLCode"/>
+        </w:rPr>
+        <w:t xml:space="preserve"> Container</w:t>
+      </w:r>
+      <w:r>
+        <w:br/>
+      </w:r>
+      <w:r>
+        <w:rPr>
+          <w:rStyle w:val="HTMLCode"/>
+        </w:rPr>
+        <w:t xml:space="preserve">        ↓</w:t>
+      </w:r>
+      <w:r>
+        <w:br/>
+      </w:r>
+      <w:r>
+        <w:br/>
+      </w:r>
+      <w:r>
+        <w:rPr>
+          <w:rStyle w:val="HTMLCode"/>
+        </w:rPr>
+        <w:t xml:space="preserve">3. </w:t>
+      </w:r>
+      <w:proofErr w:type="spellStart"/>
+      <w:r>
+        <w:rPr>
+          <w:rStyle w:val="HTMLCode"/>
+        </w:rPr>
+        <w:t>IoC</w:t>
+      </w:r>
+      <w:proofErr w:type="spellEnd"/>
+      <w:r>
+        <w:rPr>
+          <w:rStyle w:val="HTMLCode"/>
+        </w:rPr>
+        <w:t xml:space="preserve"> CONTAINER (</w:t>
+      </w:r>
+      <w:proofErr w:type="spellStart"/>
+      <w:r>
+        <w:rPr>
+          <w:rStyle w:val="HTMLCode"/>
+        </w:rPr>
+        <w:t>ApplicationContext</w:t>
+      </w:r>
+      <w:proofErr w:type="spellEnd"/>
+      <w:r>
+        <w:rPr>
+          <w:rStyle w:val="HTMLCode"/>
+        </w:rPr>
+        <w:t>)</w:t>
+      </w:r>
+      <w:r>
+        <w:br/>
+      </w:r>
+      <w:r>
+        <w:rPr>
+          <w:rStyle w:val="HTMLCode"/>
+        </w:rPr>
+        <w:t xml:space="preserve">   → Starts scanning application</w:t>
+      </w:r>
+      <w:r>
+        <w:br/>
+      </w:r>
+      <w:r>
+        <w:rPr>
+          <w:rStyle w:val="HTMLCode"/>
+        </w:rPr>
+        <w:t xml:space="preserve">   → Finds @Component classes</w:t>
+      </w:r>
+      <w:r>
+        <w:br/>
+      </w:r>
+      <w:r>
+        <w:rPr>
+          <w:rStyle w:val="HTMLCode"/>
+        </w:rPr>
+        <w:t xml:space="preserve">        ↓</w:t>
+      </w:r>
+      <w:r>
+        <w:br/>
+      </w:r>
+      <w:r>
+        <w:br/>
+      </w:r>
+      <w:r>
+        <w:rPr>
+          <w:rStyle w:val="HTMLCode"/>
+        </w:rPr>
+        <w:t>4. CREATES OBJECTS (</w:t>
+      </w:r>
+      <w:proofErr w:type="spellStart"/>
+      <w:proofErr w:type="gramStart"/>
+      <w:r>
+        <w:rPr>
+          <w:rStyle w:val="HTMLCode"/>
+        </w:rPr>
+        <w:t>IoC</w:t>
+      </w:r>
+      <w:proofErr w:type="spellEnd"/>
+      <w:proofErr w:type="gramEnd"/>
+      <w:r>
+        <w:rPr>
+          <w:rStyle w:val="HTMLCode"/>
+        </w:rPr>
+        <w:t xml:space="preserve"> part)</w:t>
+      </w:r>
+      <w:r>
+        <w:br/>
+      </w:r>
+      <w:r>
+        <w:rPr>
+          <w:rStyle w:val="HTMLCode"/>
+        </w:rPr>
+        <w:t xml:space="preserve">   → Engine object created</w:t>
+      </w:r>
+      <w:r>
+        <w:br/>
+      </w:r>
+      <w:r>
+        <w:rPr>
+          <w:rStyle w:val="HTMLCode"/>
+        </w:rPr>
+        <w:t xml:space="preserve">   → Car object created</w:t>
+      </w:r>
+      <w:r>
+        <w:br/>
+      </w:r>
+      <w:r>
+        <w:rPr>
+          <w:rStyle w:val="HTMLCode"/>
+        </w:rPr>
+        <w:t xml:space="preserve">        ↓</w:t>
+      </w:r>
+      <w:r>
+        <w:br/>
+      </w:r>
+      <w:r>
+        <w:br/>
+      </w:r>
+      <w:r>
+        <w:rPr>
+          <w:rStyle w:val="HTMLCode"/>
+        </w:rPr>
+        <w:t>5. DI (Dependency Injection)</w:t>
+      </w:r>
+      <w:r>
+        <w:br/>
+      </w:r>
+      <w:r>
+        <w:rPr>
+          <w:rStyle w:val="HTMLCode"/>
+        </w:rPr>
+        <w:t xml:space="preserve">   → </w:t>
+      </w:r>
+      <w:proofErr w:type="gramStart"/>
+      <w:r>
+        <w:rPr>
+          <w:rStyle w:val="HTMLCode"/>
+        </w:rPr>
+        <w:t>Spring</w:t>
+      </w:r>
+      <w:proofErr w:type="gramEnd"/>
+      <w:r>
+        <w:rPr>
+          <w:rStyle w:val="HTMLCode"/>
+        </w:rPr>
+        <w:t xml:space="preserve"> sees @</w:t>
+      </w:r>
+      <w:proofErr w:type="spellStart"/>
+      <w:r>
+        <w:rPr>
+          <w:rStyle w:val="HTMLCode"/>
+        </w:rPr>
+        <w:t>Autowired</w:t>
+      </w:r>
+      <w:proofErr w:type="spellEnd"/>
+      <w:r>
+        <w:br/>
+      </w:r>
+      <w:r>
+        <w:rPr>
+          <w:rStyle w:val="HTMLCode"/>
+        </w:rPr>
+        <w:t xml:space="preserve">   → Engine injected into Car</w:t>
+      </w:r>
+      <w:r>
+        <w:br/>
+      </w:r>
+      <w:r>
+        <w:rPr>
+          <w:rStyle w:val="HTMLCode"/>
+        </w:rPr>
+        <w:t xml:space="preserve">        ↓</w:t>
+      </w:r>
+      <w:r>
+        <w:br/>
+      </w:r>
+      <w:r>
+        <w:br/>
+      </w:r>
+      <w:r>
+        <w:rPr>
+          <w:rStyle w:val="HTMLCode"/>
+        </w:rPr>
+        <w:t xml:space="preserve">6. </w:t>
+      </w:r>
+      <w:proofErr w:type="spellStart"/>
+      <w:r>
+        <w:rPr>
+          <w:rStyle w:val="HTMLCode"/>
+        </w:rPr>
+        <w:t>IoC</w:t>
+      </w:r>
+      <w:proofErr w:type="spellEnd"/>
+      <w:r>
+        <w:rPr>
+          <w:rStyle w:val="HTMLCode"/>
+        </w:rPr>
+        <w:t xml:space="preserve"> CONTAINER STORES OBJECTS</w:t>
+      </w:r>
+      <w:r>
+        <w:br/>
+      </w:r>
+      <w:r>
+        <w:rPr>
+          <w:rStyle w:val="HTMLCode"/>
+        </w:rPr>
+        <w:t xml:space="preserve">   → </w:t>
+      </w:r>
+      <w:proofErr w:type="gramStart"/>
+      <w:r>
+        <w:rPr>
+          <w:rStyle w:val="HTMLCode"/>
+        </w:rPr>
+        <w:t>All</w:t>
+      </w:r>
+      <w:proofErr w:type="gramEnd"/>
+      <w:r>
+        <w:rPr>
+          <w:rStyle w:val="HTMLCode"/>
+        </w:rPr>
+        <w:t xml:space="preserve"> beans stored and managed</w:t>
+      </w:r>
+      <w:r>
+        <w:br/>
+      </w:r>
+      <w:r>
+        <w:rPr>
+          <w:rStyle w:val="HTMLCode"/>
+        </w:rPr>
+        <w:t xml:space="preserve">        ↓</w:t>
+      </w:r>
+      <w:r>
+        <w:br/>
+      </w:r>
+      <w:r>
+        <w:br/>
+      </w:r>
+      <w:r>
+        <w:rPr>
+          <w:rStyle w:val="HTMLCode"/>
+        </w:rPr>
+        <w:t>7. APPLICATION READY</w:t>
+      </w:r>
+      <w:r>
+        <w:br/>
+      </w:r>
+      <w:r>
+        <w:rPr>
+          <w:rStyle w:val="HTMLCode"/>
+        </w:rPr>
+        <w:t xml:space="preserve">   → </w:t>
+      </w:r>
+      <w:proofErr w:type="gramStart"/>
+      <w:r>
+        <w:rPr>
+          <w:rStyle w:val="HTMLCode"/>
+        </w:rPr>
+        <w:t>You</w:t>
+      </w:r>
+      <w:proofErr w:type="gramEnd"/>
+      <w:r>
+        <w:rPr>
+          <w:rStyle w:val="HTMLCode"/>
+        </w:rPr>
+        <w:t xml:space="preserve"> can use objects anytime</w:t>
       </w:r>
     </w:p>
-    <w:p>
-      <w:pPr>
-        <w:pStyle w:val="NormalWeb"/>
-      </w:pPr>
-      <w:r>
-        <w:t xml:space="preserve">👉 </w:t>
-      </w:r>
-      <w:r>
-        <w:rPr>
-          <w:rStyle w:val="Strong"/>
-        </w:rPr>
-        <w:t xml:space="preserve">Traversal = </w:t>
-      </w:r>
-      <w:proofErr w:type="gramStart"/>
-      <w:r>
-        <w:rPr>
-          <w:rStyle w:val="Strong"/>
-        </w:rPr>
-        <w:t>O(</w:t>
-      </w:r>
-      <w:proofErr w:type="gramEnd"/>
-      <w:r>
-        <w:rPr>
-          <w:rStyle w:val="Strong"/>
-        </w:rPr>
-        <w:t>n)</w:t>
-      </w:r>
-      <w:r>
-        <w:t xml:space="preserve"> (linear time complexity)</w:t>
-      </w:r>
-    </w:p>
-    <w:p/>
     <w:p/>
     <w:sectPr>
       <w:pgSz w:w="12962" w:h="8641" w:orient="landscape" w:code="1"/>
@@ -2379,6 +2821,29 @@
   <w:style w:type="paragraph" w:default="1" w:styleId="Normal">
     <w:name w:val="Normal"/>
     <w:qFormat/>
+  </w:style>
+  <w:style w:type="paragraph" w:styleId="Heading1">
+    <w:name w:val="heading 1"/>
+    <w:basedOn w:val="Normal"/>
+    <w:next w:val="Normal"/>
+    <w:link w:val="Heading1Char"/>
+    <w:uiPriority w:val="9"/>
+    <w:qFormat/>
+    <w:rsid w:val="00646954"/>
+    <w:pPr>
+      <w:keepNext/>
+      <w:keepLines/>
+      <w:spacing w:before="480" w:after="0"/>
+      <w:outlineLvl w:val="0"/>
+    </w:pPr>
+    <w:rPr>
+      <w:rFonts w:asciiTheme="majorHAnsi" w:eastAsiaTheme="majorEastAsia" w:hAnsiTheme="majorHAnsi" w:cstheme="majorBidi"/>
+      <w:b/>
+      <w:bCs/>
+      <w:color w:val="365F91" w:themeColor="accent1" w:themeShade="BF"/>
+      <w:sz w:val="28"/>
+      <w:szCs w:val="28"/>
+    </w:rPr>
   </w:style>
   <w:style w:type="paragraph" w:styleId="Heading2">
     <w:name w:val="heading 2"/>
@@ -2581,6 +3046,21 @@
       <w:color w:val="4F81BD" w:themeColor="accent1"/>
     </w:rPr>
   </w:style>
+  <w:style w:type="character" w:customStyle="1" w:styleId="Heading1Char">
+    <w:name w:val="Heading 1 Char"/>
+    <w:basedOn w:val="DefaultParagraphFont"/>
+    <w:link w:val="Heading1"/>
+    <w:uiPriority w:val="9"/>
+    <w:rsid w:val="00646954"/>
+    <w:rPr>
+      <w:rFonts w:asciiTheme="majorHAnsi" w:eastAsiaTheme="majorEastAsia" w:hAnsiTheme="majorHAnsi" w:cstheme="majorBidi"/>
+      <w:b/>
+      <w:bCs/>
+      <w:color w:val="365F91" w:themeColor="accent1" w:themeShade="BF"/>
+      <w:sz w:val="28"/>
+      <w:szCs w:val="28"/>
+    </w:rPr>
+  </w:style>
 </w:styles>
 </file>
 
@@ -2743,6 +3223,29 @@
   <w:style w:type="paragraph" w:default="1" w:styleId="Normal">
     <w:name w:val="Normal"/>
     <w:qFormat/>
+  </w:style>
+  <w:style w:type="paragraph" w:styleId="Heading1">
+    <w:name w:val="heading 1"/>
+    <w:basedOn w:val="Normal"/>
+    <w:next w:val="Normal"/>
+    <w:link w:val="Heading1Char"/>
+    <w:uiPriority w:val="9"/>
+    <w:qFormat/>
+    <w:rsid w:val="00646954"/>
+    <w:pPr>
+      <w:keepNext/>
+      <w:keepLines/>
+      <w:spacing w:before="480" w:after="0"/>
+      <w:outlineLvl w:val="0"/>
+    </w:pPr>
+    <w:rPr>
+      <w:rFonts w:asciiTheme="majorHAnsi" w:eastAsiaTheme="majorEastAsia" w:hAnsiTheme="majorHAnsi" w:cstheme="majorBidi"/>
+      <w:b/>
+      <w:bCs/>
+      <w:color w:val="365F91" w:themeColor="accent1" w:themeShade="BF"/>
+      <w:sz w:val="28"/>
+      <w:szCs w:val="28"/>
+    </w:rPr>
   </w:style>
   <w:style w:type="paragraph" w:styleId="Heading2">
     <w:name w:val="heading 2"/>
@@ -2943,6 +3446,21 @@
       <w:b/>
       <w:bCs/>
       <w:color w:val="4F81BD" w:themeColor="accent1"/>
+    </w:rPr>
+  </w:style>
+  <w:style w:type="character" w:customStyle="1" w:styleId="Heading1Char">
+    <w:name w:val="Heading 1 Char"/>
+    <w:basedOn w:val="DefaultParagraphFont"/>
+    <w:link w:val="Heading1"/>
+    <w:uiPriority w:val="9"/>
+    <w:rsid w:val="00646954"/>
+    <w:rPr>
+      <w:rFonts w:asciiTheme="majorHAnsi" w:eastAsiaTheme="majorEastAsia" w:hAnsiTheme="majorHAnsi" w:cstheme="majorBidi"/>
+      <w:b/>
+      <w:bCs/>
+      <w:color w:val="365F91" w:themeColor="accent1" w:themeShade="BF"/>
+      <w:sz w:val="28"/>
+      <w:szCs w:val="28"/>
     </w:rPr>
   </w:style>
 </w:styles>

</xml_diff>

<commit_message>
add new pointer in spring core document
</commit_message>
<xml_diff>
--- a/TheorynCoding/Study Material/Java Overall/Java Overall/Important Notes.docx
+++ b/TheorynCoding/Study Material/Java Overall/Java Overall/Important Notes.docx
@@ -1914,379 +1914,382 @@
         </w:rPr>
         <w:t xml:space="preserve">   → Rule: Spring should control object creation</w:t>
       </w:r>
+      <w:r>
+        <w:br/>
+      </w:r>
+      <w:r>
+        <w:rPr>
+          <w:rStyle w:val="HTMLCode"/>
+        </w:rPr>
+        <w:t xml:space="preserve">        ↓</w:t>
+      </w:r>
+      <w:r>
+        <w:br/>
+      </w:r>
+      <w:r>
+        <w:br/>
+      </w:r>
+      <w:r>
+        <w:rPr>
+          <w:rStyle w:val="HTMLCode"/>
+        </w:rPr>
+        <w:t>2. SPRING BOOT STARTS</w:t>
+      </w:r>
+      <w:r>
+        <w:br/>
+      </w:r>
+      <w:r>
+        <w:rPr>
+          <w:rStyle w:val="HTMLCode"/>
+        </w:rPr>
+        <w:lastRenderedPageBreak/>
+        <w:t xml:space="preserve">   → </w:t>
+      </w:r>
+      <w:proofErr w:type="spellStart"/>
+      <w:proofErr w:type="gramStart"/>
+      <w:r>
+        <w:rPr>
+          <w:rStyle w:val="HTMLCode"/>
+        </w:rPr>
+        <w:t>SpringApplication.run</w:t>
+      </w:r>
+      <w:proofErr w:type="spellEnd"/>
+      <w:r>
+        <w:rPr>
+          <w:rStyle w:val="HTMLCode"/>
+        </w:rPr>
+        <w:t>(</w:t>
+      </w:r>
+      <w:proofErr w:type="spellStart"/>
+      <w:proofErr w:type="gramEnd"/>
+      <w:r>
+        <w:rPr>
+          <w:rStyle w:val="HTMLCode"/>
+        </w:rPr>
+        <w:t>App.class</w:t>
+      </w:r>
+      <w:proofErr w:type="spellEnd"/>
+      <w:r>
+        <w:rPr>
+          <w:rStyle w:val="HTMLCode"/>
+        </w:rPr>
+        <w:t>, args)</w:t>
+      </w:r>
+      <w:r>
+        <w:br/>
+      </w:r>
+      <w:r>
+        <w:rPr>
+          <w:rStyle w:val="HTMLCode"/>
+        </w:rPr>
+        <w:t xml:space="preserve">   → Initializes </w:t>
+      </w:r>
+      <w:proofErr w:type="spellStart"/>
+      <w:r>
+        <w:rPr>
+          <w:rStyle w:val="HTMLCode"/>
+        </w:rPr>
+        <w:t>IoC</w:t>
+      </w:r>
+      <w:proofErr w:type="spellEnd"/>
+      <w:r>
+        <w:rPr>
+          <w:rStyle w:val="HTMLCode"/>
+        </w:rPr>
+        <w:t xml:space="preserve"> Container</w:t>
+      </w:r>
+      <w:r>
+        <w:br/>
+      </w:r>
+      <w:r>
+        <w:rPr>
+          <w:rStyle w:val="HTMLCode"/>
+        </w:rPr>
+        <w:t xml:space="preserve">        ↓</w:t>
+      </w:r>
+      <w:r>
+        <w:br/>
+      </w:r>
+      <w:r>
+        <w:br/>
+      </w:r>
+      <w:r>
+        <w:rPr>
+          <w:rStyle w:val="HTMLCode"/>
+        </w:rPr>
+        <w:t xml:space="preserve">3. </w:t>
+      </w:r>
+      <w:proofErr w:type="spellStart"/>
+      <w:r>
+        <w:rPr>
+          <w:rStyle w:val="HTMLCode"/>
+        </w:rPr>
+        <w:t>IoC</w:t>
+      </w:r>
+      <w:proofErr w:type="spellEnd"/>
+      <w:r>
+        <w:rPr>
+          <w:rStyle w:val="HTMLCode"/>
+        </w:rPr>
+        <w:t xml:space="preserve"> CONTAINER (</w:t>
+      </w:r>
+      <w:proofErr w:type="spellStart"/>
+      <w:r>
+        <w:rPr>
+          <w:rStyle w:val="HTMLCode"/>
+        </w:rPr>
+        <w:t>ApplicationContext</w:t>
+      </w:r>
+      <w:proofErr w:type="spellEnd"/>
+      <w:r>
+        <w:rPr>
+          <w:rStyle w:val="HTMLCode"/>
+        </w:rPr>
+        <w:t>)</w:t>
+      </w:r>
+      <w:r>
+        <w:br/>
+      </w:r>
+      <w:r>
+        <w:rPr>
+          <w:rStyle w:val="HTMLCode"/>
+        </w:rPr>
+        <w:t xml:space="preserve">   → Starts scanning application</w:t>
+      </w:r>
+      <w:r>
+        <w:br/>
+      </w:r>
+      <w:r>
+        <w:rPr>
+          <w:rStyle w:val="HTMLCode"/>
+        </w:rPr>
+        <w:t xml:space="preserve">   → Finds @Component classes</w:t>
+      </w:r>
+      <w:r>
+        <w:br/>
+      </w:r>
+      <w:r>
+        <w:rPr>
+          <w:rStyle w:val="HTMLCode"/>
+        </w:rPr>
+        <w:t xml:space="preserve">        ↓</w:t>
+      </w:r>
+      <w:r>
+        <w:br/>
+      </w:r>
+      <w:r>
+        <w:br/>
+      </w:r>
+      <w:r>
+        <w:rPr>
+          <w:rStyle w:val="HTMLCode"/>
+        </w:rPr>
+        <w:t>4. CREATES OBJECTS (</w:t>
+      </w:r>
+      <w:proofErr w:type="spellStart"/>
+      <w:proofErr w:type="gramStart"/>
+      <w:r>
+        <w:rPr>
+          <w:rStyle w:val="HTMLCode"/>
+        </w:rPr>
+        <w:t>IoC</w:t>
+      </w:r>
+      <w:proofErr w:type="spellEnd"/>
+      <w:proofErr w:type="gramEnd"/>
+      <w:r>
+        <w:rPr>
+          <w:rStyle w:val="HTMLCode"/>
+        </w:rPr>
+        <w:t xml:space="preserve"> part)</w:t>
+      </w:r>
+      <w:r>
+        <w:br/>
+      </w:r>
+      <w:r>
+        <w:rPr>
+          <w:rStyle w:val="HTMLCode"/>
+        </w:rPr>
+        <w:t xml:space="preserve">   → Engine object created</w:t>
+      </w:r>
+      <w:r>
+        <w:br/>
+      </w:r>
+      <w:r>
+        <w:rPr>
+          <w:rStyle w:val="HTMLCode"/>
+        </w:rPr>
+        <w:t xml:space="preserve">   → Car object created</w:t>
+      </w:r>
+      <w:r>
+        <w:br/>
+      </w:r>
+      <w:r>
+        <w:rPr>
+          <w:rStyle w:val="HTMLCode"/>
+        </w:rPr>
+        <w:t xml:space="preserve">        ↓</w:t>
+      </w:r>
+      <w:r>
+        <w:br/>
+      </w:r>
+      <w:r>
+        <w:br/>
+      </w:r>
+      <w:r>
+        <w:rPr>
+          <w:rStyle w:val="HTMLCode"/>
+        </w:rPr>
+        <w:t>5. DI (Dependency Injection)</w:t>
+      </w:r>
+      <w:r>
+        <w:br/>
+      </w:r>
+      <w:r>
+        <w:rPr>
+          <w:rStyle w:val="HTMLCode"/>
+        </w:rPr>
+        <w:t xml:space="preserve">   → </w:t>
+      </w:r>
+      <w:proofErr w:type="gramStart"/>
+      <w:r>
+        <w:rPr>
+          <w:rStyle w:val="HTMLCode"/>
+        </w:rPr>
+        <w:t>Spring</w:t>
+      </w:r>
+      <w:proofErr w:type="gramEnd"/>
+      <w:r>
+        <w:rPr>
+          <w:rStyle w:val="HTMLCode"/>
+        </w:rPr>
+        <w:t xml:space="preserve"> sees @</w:t>
+      </w:r>
+      <w:proofErr w:type="spellStart"/>
+      <w:r>
+        <w:rPr>
+          <w:rStyle w:val="HTMLCode"/>
+        </w:rPr>
+        <w:t>Autowired</w:t>
+      </w:r>
+      <w:proofErr w:type="spellEnd"/>
+      <w:r>
+        <w:br/>
+      </w:r>
+      <w:r>
+        <w:rPr>
+          <w:rStyle w:val="HTMLCode"/>
+        </w:rPr>
+        <w:t xml:space="preserve">   → Engine injected into Car</w:t>
+      </w:r>
+      <w:r>
+        <w:br/>
+      </w:r>
+      <w:r>
+        <w:rPr>
+          <w:rStyle w:val="HTMLCode"/>
+        </w:rPr>
+        <w:t xml:space="preserve">        ↓</w:t>
+      </w:r>
+      <w:r>
+        <w:br/>
+      </w:r>
+      <w:r>
+        <w:br/>
+      </w:r>
+      <w:r>
+        <w:rPr>
+          <w:rStyle w:val="HTMLCode"/>
+        </w:rPr>
+        <w:t xml:space="preserve">6. </w:t>
+      </w:r>
+      <w:proofErr w:type="spellStart"/>
+      <w:r>
+        <w:rPr>
+          <w:rStyle w:val="HTMLCode"/>
+        </w:rPr>
+        <w:t>IoC</w:t>
+      </w:r>
+      <w:proofErr w:type="spellEnd"/>
+      <w:r>
+        <w:rPr>
+          <w:rStyle w:val="HTMLCode"/>
+        </w:rPr>
+        <w:t xml:space="preserve"> CONTAINER STORES OBJECTS</w:t>
+      </w:r>
+      <w:r>
+        <w:br/>
+      </w:r>
+      <w:r>
+        <w:rPr>
+          <w:rStyle w:val="HTMLCode"/>
+        </w:rPr>
+        <w:t xml:space="preserve">   → </w:t>
+      </w:r>
+      <w:proofErr w:type="gramStart"/>
+      <w:r>
+        <w:rPr>
+          <w:rStyle w:val="HTMLCode"/>
+        </w:rPr>
+        <w:t>All</w:t>
+      </w:r>
+      <w:proofErr w:type="gramEnd"/>
+      <w:r>
+        <w:rPr>
+          <w:rStyle w:val="HTMLCode"/>
+        </w:rPr>
+        <w:t xml:space="preserve"> beans stored and managed</w:t>
+      </w:r>
+      <w:r>
+        <w:br/>
+      </w:r>
+      <w:r>
+        <w:rPr>
+          <w:rStyle w:val="HTMLCode"/>
+        </w:rPr>
+        <w:t xml:space="preserve">        ↓</w:t>
+      </w:r>
+      <w:r>
+        <w:br/>
+      </w:r>
+      <w:r>
+        <w:br/>
+      </w:r>
+      <w:r>
+        <w:rPr>
+          <w:rStyle w:val="HTMLCode"/>
+        </w:rPr>
+        <w:t>7. APPLICATION READY</w:t>
+      </w:r>
+      <w:r>
+        <w:br/>
+      </w:r>
+      <w:r>
+        <w:rPr>
+          <w:rStyle w:val="HTMLCode"/>
+        </w:rPr>
+        <w:t xml:space="preserve">   → </w:t>
+      </w:r>
+      <w:proofErr w:type="gramStart"/>
+      <w:r>
+        <w:rPr>
+          <w:rStyle w:val="HTMLCode"/>
+        </w:rPr>
+        <w:t>You</w:t>
+      </w:r>
+      <w:proofErr w:type="gramEnd"/>
+      <w:r>
+        <w:rPr>
+          <w:rStyle w:val="HTMLCode"/>
+        </w:rPr>
+        <w:t xml:space="preserve"> can use objects anytime</w:t>
+      </w:r>
+    </w:p>
+    <w:p/>
+    <w:p/>
+    <w:p>
       <w:bookmarkStart w:id="0" w:name="_GoBack"/>
       <w:bookmarkEnd w:id="0"/>
-      <w:r>
-        <w:br/>
-      </w:r>
-      <w:r>
-        <w:rPr>
-          <w:rStyle w:val="HTMLCode"/>
-        </w:rPr>
-        <w:t xml:space="preserve">        ↓</w:t>
-      </w:r>
-      <w:r>
-        <w:br/>
-      </w:r>
-      <w:r>
-        <w:br/>
-      </w:r>
-      <w:r>
-        <w:rPr>
-          <w:rStyle w:val="HTMLCode"/>
-        </w:rPr>
-        <w:t>2. SPRING BOOT STARTS</w:t>
-      </w:r>
-      <w:r>
-        <w:br/>
-      </w:r>
-      <w:r>
-        <w:rPr>
-          <w:rStyle w:val="HTMLCode"/>
-        </w:rPr>
-        <w:lastRenderedPageBreak/>
-        <w:t xml:space="preserve">   → </w:t>
-      </w:r>
-      <w:proofErr w:type="spellStart"/>
-      <w:proofErr w:type="gramStart"/>
-      <w:r>
-        <w:rPr>
-          <w:rStyle w:val="HTMLCode"/>
-        </w:rPr>
-        <w:t>SpringApplication.run</w:t>
-      </w:r>
-      <w:proofErr w:type="spellEnd"/>
-      <w:r>
-        <w:rPr>
-          <w:rStyle w:val="HTMLCode"/>
-        </w:rPr>
-        <w:t>(</w:t>
-      </w:r>
-      <w:proofErr w:type="spellStart"/>
-      <w:proofErr w:type="gramEnd"/>
-      <w:r>
-        <w:rPr>
-          <w:rStyle w:val="HTMLCode"/>
-        </w:rPr>
-        <w:t>App.class</w:t>
-      </w:r>
-      <w:proofErr w:type="spellEnd"/>
-      <w:r>
-        <w:rPr>
-          <w:rStyle w:val="HTMLCode"/>
-        </w:rPr>
-        <w:t>, args)</w:t>
-      </w:r>
-      <w:r>
-        <w:br/>
-      </w:r>
-      <w:r>
-        <w:rPr>
-          <w:rStyle w:val="HTMLCode"/>
-        </w:rPr>
-        <w:t xml:space="preserve">   → Initializes </w:t>
-      </w:r>
-      <w:proofErr w:type="spellStart"/>
-      <w:r>
-        <w:rPr>
-          <w:rStyle w:val="HTMLCode"/>
-        </w:rPr>
-        <w:t>IoC</w:t>
-      </w:r>
-      <w:proofErr w:type="spellEnd"/>
-      <w:r>
-        <w:rPr>
-          <w:rStyle w:val="HTMLCode"/>
-        </w:rPr>
-        <w:t xml:space="preserve"> Container</w:t>
-      </w:r>
-      <w:r>
-        <w:br/>
-      </w:r>
-      <w:r>
-        <w:rPr>
-          <w:rStyle w:val="HTMLCode"/>
-        </w:rPr>
-        <w:t xml:space="preserve">        ↓</w:t>
-      </w:r>
-      <w:r>
-        <w:br/>
-      </w:r>
-      <w:r>
-        <w:br/>
-      </w:r>
-      <w:r>
-        <w:rPr>
-          <w:rStyle w:val="HTMLCode"/>
-        </w:rPr>
-        <w:t xml:space="preserve">3. </w:t>
-      </w:r>
-      <w:proofErr w:type="spellStart"/>
-      <w:r>
-        <w:rPr>
-          <w:rStyle w:val="HTMLCode"/>
-        </w:rPr>
-        <w:t>IoC</w:t>
-      </w:r>
-      <w:proofErr w:type="spellEnd"/>
-      <w:r>
-        <w:rPr>
-          <w:rStyle w:val="HTMLCode"/>
-        </w:rPr>
-        <w:t xml:space="preserve"> CONTAINER (</w:t>
-      </w:r>
-      <w:proofErr w:type="spellStart"/>
-      <w:r>
-        <w:rPr>
-          <w:rStyle w:val="HTMLCode"/>
-        </w:rPr>
-        <w:t>ApplicationContext</w:t>
-      </w:r>
-      <w:proofErr w:type="spellEnd"/>
-      <w:r>
-        <w:rPr>
-          <w:rStyle w:val="HTMLCode"/>
-        </w:rPr>
-        <w:t>)</w:t>
-      </w:r>
-      <w:r>
-        <w:br/>
-      </w:r>
-      <w:r>
-        <w:rPr>
-          <w:rStyle w:val="HTMLCode"/>
-        </w:rPr>
-        <w:t xml:space="preserve">   → Starts scanning application</w:t>
-      </w:r>
-      <w:r>
-        <w:br/>
-      </w:r>
-      <w:r>
-        <w:rPr>
-          <w:rStyle w:val="HTMLCode"/>
-        </w:rPr>
-        <w:t xml:space="preserve">   → Finds @Component classes</w:t>
-      </w:r>
-      <w:r>
-        <w:br/>
-      </w:r>
-      <w:r>
-        <w:rPr>
-          <w:rStyle w:val="HTMLCode"/>
-        </w:rPr>
-        <w:t xml:space="preserve">        ↓</w:t>
-      </w:r>
-      <w:r>
-        <w:br/>
-      </w:r>
-      <w:r>
-        <w:br/>
-      </w:r>
-      <w:r>
-        <w:rPr>
-          <w:rStyle w:val="HTMLCode"/>
-        </w:rPr>
-        <w:t>4. CREATES OBJECTS (</w:t>
-      </w:r>
-      <w:proofErr w:type="spellStart"/>
-      <w:proofErr w:type="gramStart"/>
-      <w:r>
-        <w:rPr>
-          <w:rStyle w:val="HTMLCode"/>
-        </w:rPr>
-        <w:t>IoC</w:t>
-      </w:r>
-      <w:proofErr w:type="spellEnd"/>
-      <w:proofErr w:type="gramEnd"/>
-      <w:r>
-        <w:rPr>
-          <w:rStyle w:val="HTMLCode"/>
-        </w:rPr>
-        <w:t xml:space="preserve"> part)</w:t>
-      </w:r>
-      <w:r>
-        <w:br/>
-      </w:r>
-      <w:r>
-        <w:rPr>
-          <w:rStyle w:val="HTMLCode"/>
-        </w:rPr>
-        <w:t xml:space="preserve">   → Engine object created</w:t>
-      </w:r>
-      <w:r>
-        <w:br/>
-      </w:r>
-      <w:r>
-        <w:rPr>
-          <w:rStyle w:val="HTMLCode"/>
-        </w:rPr>
-        <w:t xml:space="preserve">   → Car object created</w:t>
-      </w:r>
-      <w:r>
-        <w:br/>
-      </w:r>
-      <w:r>
-        <w:rPr>
-          <w:rStyle w:val="HTMLCode"/>
-        </w:rPr>
-        <w:t xml:space="preserve">        ↓</w:t>
-      </w:r>
-      <w:r>
-        <w:br/>
-      </w:r>
-      <w:r>
-        <w:br/>
-      </w:r>
-      <w:r>
-        <w:rPr>
-          <w:rStyle w:val="HTMLCode"/>
-        </w:rPr>
-        <w:t>5. DI (Dependency Injection)</w:t>
-      </w:r>
-      <w:r>
-        <w:br/>
-      </w:r>
-      <w:r>
-        <w:rPr>
-          <w:rStyle w:val="HTMLCode"/>
-        </w:rPr>
-        <w:t xml:space="preserve">   → </w:t>
-      </w:r>
-      <w:proofErr w:type="gramStart"/>
-      <w:r>
-        <w:rPr>
-          <w:rStyle w:val="HTMLCode"/>
-        </w:rPr>
-        <w:t>Spring</w:t>
-      </w:r>
-      <w:proofErr w:type="gramEnd"/>
-      <w:r>
-        <w:rPr>
-          <w:rStyle w:val="HTMLCode"/>
-        </w:rPr>
-        <w:t xml:space="preserve"> sees @</w:t>
-      </w:r>
-      <w:proofErr w:type="spellStart"/>
-      <w:r>
-        <w:rPr>
-          <w:rStyle w:val="HTMLCode"/>
-        </w:rPr>
-        <w:t>Autowired</w:t>
-      </w:r>
-      <w:proofErr w:type="spellEnd"/>
-      <w:r>
-        <w:br/>
-      </w:r>
-      <w:r>
-        <w:rPr>
-          <w:rStyle w:val="HTMLCode"/>
-        </w:rPr>
-        <w:t xml:space="preserve">   → Engine injected into Car</w:t>
-      </w:r>
-      <w:r>
-        <w:br/>
-      </w:r>
-      <w:r>
-        <w:rPr>
-          <w:rStyle w:val="HTMLCode"/>
-        </w:rPr>
-        <w:t xml:space="preserve">        ↓</w:t>
-      </w:r>
-      <w:r>
-        <w:br/>
-      </w:r>
-      <w:r>
-        <w:br/>
-      </w:r>
-      <w:r>
-        <w:rPr>
-          <w:rStyle w:val="HTMLCode"/>
-        </w:rPr>
-        <w:t xml:space="preserve">6. </w:t>
-      </w:r>
-      <w:proofErr w:type="spellStart"/>
-      <w:r>
-        <w:rPr>
-          <w:rStyle w:val="HTMLCode"/>
-        </w:rPr>
-        <w:t>IoC</w:t>
-      </w:r>
-      <w:proofErr w:type="spellEnd"/>
-      <w:r>
-        <w:rPr>
-          <w:rStyle w:val="HTMLCode"/>
-        </w:rPr>
-        <w:t xml:space="preserve"> CONTAINER STORES OBJECTS</w:t>
-      </w:r>
-      <w:r>
-        <w:br/>
-      </w:r>
-      <w:r>
-        <w:rPr>
-          <w:rStyle w:val="HTMLCode"/>
-        </w:rPr>
-        <w:t xml:space="preserve">   → </w:t>
-      </w:r>
-      <w:proofErr w:type="gramStart"/>
-      <w:r>
-        <w:rPr>
-          <w:rStyle w:val="HTMLCode"/>
-        </w:rPr>
-        <w:t>All</w:t>
-      </w:r>
-      <w:proofErr w:type="gramEnd"/>
-      <w:r>
-        <w:rPr>
-          <w:rStyle w:val="HTMLCode"/>
-        </w:rPr>
-        <w:t xml:space="preserve"> beans stored and managed</w:t>
-      </w:r>
-      <w:r>
-        <w:br/>
-      </w:r>
-      <w:r>
-        <w:rPr>
-          <w:rStyle w:val="HTMLCode"/>
-        </w:rPr>
-        <w:t xml:space="preserve">        ↓</w:t>
-      </w:r>
-      <w:r>
-        <w:br/>
-      </w:r>
-      <w:r>
-        <w:br/>
-      </w:r>
-      <w:r>
-        <w:rPr>
-          <w:rStyle w:val="HTMLCode"/>
-        </w:rPr>
-        <w:t>7. APPLICATION READY</w:t>
-      </w:r>
-      <w:r>
-        <w:br/>
-      </w:r>
-      <w:r>
-        <w:rPr>
-          <w:rStyle w:val="HTMLCode"/>
-        </w:rPr>
-        <w:t xml:space="preserve">   → </w:t>
-      </w:r>
-      <w:proofErr w:type="gramStart"/>
-      <w:r>
-        <w:rPr>
-          <w:rStyle w:val="HTMLCode"/>
-        </w:rPr>
-        <w:t>You</w:t>
-      </w:r>
-      <w:proofErr w:type="gramEnd"/>
-      <w:r>
-        <w:rPr>
-          <w:rStyle w:val="HTMLCode"/>
-        </w:rPr>
-        <w:t xml:space="preserve"> can use objects anytime</w:t>
-      </w:r>
     </w:p>
-    <w:p/>
     <w:sectPr>
       <w:pgSz w:w="12962" w:h="8641" w:orient="landscape" w:code="1"/>
       <w:pgMar w:top="864" w:right="1077" w:bottom="864" w:left="1077" w:header="709" w:footer="709" w:gutter="0"/>
@@ -2300,6 +2303,751 @@
 <file path=word/numbering.xml><?xml version="1.0" encoding="utf-8"?>
 <w:numbering xmlns:wpc="http://schemas.microsoft.com/office/word/2010/wordprocessingCanvas" xmlns:mc="http://schemas.openxmlformats.org/markup-compatibility/2006" xmlns:o="urn:schemas-microsoft-com:office:office" xmlns:r="http://schemas.openxmlformats.org/officeDocument/2006/relationships" xmlns:m="http://schemas.openxmlformats.org/officeDocument/2006/math" xmlns:v="urn:schemas-microsoft-com:vml" xmlns:wp14="http://schemas.microsoft.com/office/word/2010/wordprocessingDrawing" xmlns:wp="http://schemas.openxmlformats.org/drawingml/2006/wordprocessingDrawing" xmlns:w10="urn:schemas-microsoft-com:office:word" xmlns:w="http://schemas.openxmlformats.org/wordprocessingml/2006/main" xmlns:w14="http://schemas.microsoft.com/office/word/2010/wordml" xmlns:wpg="http://schemas.microsoft.com/office/word/2010/wordprocessingGroup" xmlns:wpi="http://schemas.microsoft.com/office/word/2010/wordprocessingInk" xmlns:wne="http://schemas.microsoft.com/office/word/2006/wordml" xmlns:wps="http://schemas.microsoft.com/office/word/2010/wordprocessingShape" mc:Ignorable="w14 wp14">
   <w:abstractNum w:abstractNumId="0">
+    <w:nsid w:val="08432C12"/>
+    <w:multiLevelType w:val="multilevel"/>
+    <w:tmpl w:val="B06CAF02"/>
+    <w:lvl w:ilvl="0">
+      <w:start w:val="1"/>
+      <w:numFmt w:val="bullet"/>
+      <w:lvlText w:val=""/>
+      <w:lvlJc w:val="left"/>
+      <w:pPr>
+        <w:tabs>
+          <w:tab w:val="num" w:pos="720"/>
+        </w:tabs>
+        <w:ind w:left="720" w:hanging="360"/>
+      </w:pPr>
+      <w:rPr>
+        <w:rFonts w:ascii="Symbol" w:hAnsi="Symbol" w:hint="default"/>
+        <w:sz w:val="20"/>
+      </w:rPr>
+    </w:lvl>
+    <w:lvl w:ilvl="1" w:tentative="1">
+      <w:start w:val="1"/>
+      <w:numFmt w:val="bullet"/>
+      <w:lvlText w:val="o"/>
+      <w:lvlJc w:val="left"/>
+      <w:pPr>
+        <w:tabs>
+          <w:tab w:val="num" w:pos="1440"/>
+        </w:tabs>
+        <w:ind w:left="1440" w:hanging="360"/>
+      </w:pPr>
+      <w:rPr>
+        <w:rFonts w:ascii="Courier New" w:hAnsi="Courier New" w:hint="default"/>
+        <w:sz w:val="20"/>
+      </w:rPr>
+    </w:lvl>
+    <w:lvl w:ilvl="2" w:tentative="1">
+      <w:start w:val="1"/>
+      <w:numFmt w:val="bullet"/>
+      <w:lvlText w:val=""/>
+      <w:lvlJc w:val="left"/>
+      <w:pPr>
+        <w:tabs>
+          <w:tab w:val="num" w:pos="2160"/>
+        </w:tabs>
+        <w:ind w:left="2160" w:hanging="360"/>
+      </w:pPr>
+      <w:rPr>
+        <w:rFonts w:ascii="Wingdings" w:hAnsi="Wingdings" w:hint="default"/>
+        <w:sz w:val="20"/>
+      </w:rPr>
+    </w:lvl>
+    <w:lvl w:ilvl="3" w:tentative="1">
+      <w:start w:val="1"/>
+      <w:numFmt w:val="bullet"/>
+      <w:lvlText w:val=""/>
+      <w:lvlJc w:val="left"/>
+      <w:pPr>
+        <w:tabs>
+          <w:tab w:val="num" w:pos="2880"/>
+        </w:tabs>
+        <w:ind w:left="2880" w:hanging="360"/>
+      </w:pPr>
+      <w:rPr>
+        <w:rFonts w:ascii="Wingdings" w:hAnsi="Wingdings" w:hint="default"/>
+        <w:sz w:val="20"/>
+      </w:rPr>
+    </w:lvl>
+    <w:lvl w:ilvl="4" w:tentative="1">
+      <w:start w:val="1"/>
+      <w:numFmt w:val="bullet"/>
+      <w:lvlText w:val=""/>
+      <w:lvlJc w:val="left"/>
+      <w:pPr>
+        <w:tabs>
+          <w:tab w:val="num" w:pos="3600"/>
+        </w:tabs>
+        <w:ind w:left="3600" w:hanging="360"/>
+      </w:pPr>
+      <w:rPr>
+        <w:rFonts w:ascii="Wingdings" w:hAnsi="Wingdings" w:hint="default"/>
+        <w:sz w:val="20"/>
+      </w:rPr>
+    </w:lvl>
+    <w:lvl w:ilvl="5" w:tentative="1">
+      <w:start w:val="1"/>
+      <w:numFmt w:val="bullet"/>
+      <w:lvlText w:val=""/>
+      <w:lvlJc w:val="left"/>
+      <w:pPr>
+        <w:tabs>
+          <w:tab w:val="num" w:pos="4320"/>
+        </w:tabs>
+        <w:ind w:left="4320" w:hanging="360"/>
+      </w:pPr>
+      <w:rPr>
+        <w:rFonts w:ascii="Wingdings" w:hAnsi="Wingdings" w:hint="default"/>
+        <w:sz w:val="20"/>
+      </w:rPr>
+    </w:lvl>
+    <w:lvl w:ilvl="6" w:tentative="1">
+      <w:start w:val="1"/>
+      <w:numFmt w:val="bullet"/>
+      <w:lvlText w:val=""/>
+      <w:lvlJc w:val="left"/>
+      <w:pPr>
+        <w:tabs>
+          <w:tab w:val="num" w:pos="5040"/>
+        </w:tabs>
+        <w:ind w:left="5040" w:hanging="360"/>
+      </w:pPr>
+      <w:rPr>
+        <w:rFonts w:ascii="Wingdings" w:hAnsi="Wingdings" w:hint="default"/>
+        <w:sz w:val="20"/>
+      </w:rPr>
+    </w:lvl>
+    <w:lvl w:ilvl="7" w:tentative="1">
+      <w:start w:val="1"/>
+      <w:numFmt w:val="bullet"/>
+      <w:lvlText w:val=""/>
+      <w:lvlJc w:val="left"/>
+      <w:pPr>
+        <w:tabs>
+          <w:tab w:val="num" w:pos="5760"/>
+        </w:tabs>
+        <w:ind w:left="5760" w:hanging="360"/>
+      </w:pPr>
+      <w:rPr>
+        <w:rFonts w:ascii="Wingdings" w:hAnsi="Wingdings" w:hint="default"/>
+        <w:sz w:val="20"/>
+      </w:rPr>
+    </w:lvl>
+    <w:lvl w:ilvl="8" w:tentative="1">
+      <w:start w:val="1"/>
+      <w:numFmt w:val="bullet"/>
+      <w:lvlText w:val=""/>
+      <w:lvlJc w:val="left"/>
+      <w:pPr>
+        <w:tabs>
+          <w:tab w:val="num" w:pos="6480"/>
+        </w:tabs>
+        <w:ind w:left="6480" w:hanging="360"/>
+      </w:pPr>
+      <w:rPr>
+        <w:rFonts w:ascii="Wingdings" w:hAnsi="Wingdings" w:hint="default"/>
+        <w:sz w:val="20"/>
+      </w:rPr>
+    </w:lvl>
+  </w:abstractNum>
+  <w:abstractNum w:abstractNumId="1">
+    <w:nsid w:val="0A8E2716"/>
+    <w:multiLevelType w:val="multilevel"/>
+    <w:tmpl w:val="63E257EA"/>
+    <w:lvl w:ilvl="0">
+      <w:start w:val="1"/>
+      <w:numFmt w:val="bullet"/>
+      <w:lvlText w:val=""/>
+      <w:lvlJc w:val="left"/>
+      <w:pPr>
+        <w:tabs>
+          <w:tab w:val="num" w:pos="720"/>
+        </w:tabs>
+        <w:ind w:left="720" w:hanging="360"/>
+      </w:pPr>
+      <w:rPr>
+        <w:rFonts w:ascii="Symbol" w:hAnsi="Symbol" w:hint="default"/>
+        <w:sz w:val="20"/>
+      </w:rPr>
+    </w:lvl>
+    <w:lvl w:ilvl="1" w:tentative="1">
+      <w:start w:val="1"/>
+      <w:numFmt w:val="bullet"/>
+      <w:lvlText w:val="o"/>
+      <w:lvlJc w:val="left"/>
+      <w:pPr>
+        <w:tabs>
+          <w:tab w:val="num" w:pos="1440"/>
+        </w:tabs>
+        <w:ind w:left="1440" w:hanging="360"/>
+      </w:pPr>
+      <w:rPr>
+        <w:rFonts w:ascii="Courier New" w:hAnsi="Courier New" w:hint="default"/>
+        <w:sz w:val="20"/>
+      </w:rPr>
+    </w:lvl>
+    <w:lvl w:ilvl="2" w:tentative="1">
+      <w:start w:val="1"/>
+      <w:numFmt w:val="bullet"/>
+      <w:lvlText w:val=""/>
+      <w:lvlJc w:val="left"/>
+      <w:pPr>
+        <w:tabs>
+          <w:tab w:val="num" w:pos="2160"/>
+        </w:tabs>
+        <w:ind w:left="2160" w:hanging="360"/>
+      </w:pPr>
+      <w:rPr>
+        <w:rFonts w:ascii="Wingdings" w:hAnsi="Wingdings" w:hint="default"/>
+        <w:sz w:val="20"/>
+      </w:rPr>
+    </w:lvl>
+    <w:lvl w:ilvl="3" w:tentative="1">
+      <w:start w:val="1"/>
+      <w:numFmt w:val="bullet"/>
+      <w:lvlText w:val=""/>
+      <w:lvlJc w:val="left"/>
+      <w:pPr>
+        <w:tabs>
+          <w:tab w:val="num" w:pos="2880"/>
+        </w:tabs>
+        <w:ind w:left="2880" w:hanging="360"/>
+      </w:pPr>
+      <w:rPr>
+        <w:rFonts w:ascii="Wingdings" w:hAnsi="Wingdings" w:hint="default"/>
+        <w:sz w:val="20"/>
+      </w:rPr>
+    </w:lvl>
+    <w:lvl w:ilvl="4" w:tentative="1">
+      <w:start w:val="1"/>
+      <w:numFmt w:val="bullet"/>
+      <w:lvlText w:val=""/>
+      <w:lvlJc w:val="left"/>
+      <w:pPr>
+        <w:tabs>
+          <w:tab w:val="num" w:pos="3600"/>
+        </w:tabs>
+        <w:ind w:left="3600" w:hanging="360"/>
+      </w:pPr>
+      <w:rPr>
+        <w:rFonts w:ascii="Wingdings" w:hAnsi="Wingdings" w:hint="default"/>
+        <w:sz w:val="20"/>
+      </w:rPr>
+    </w:lvl>
+    <w:lvl w:ilvl="5" w:tentative="1">
+      <w:start w:val="1"/>
+      <w:numFmt w:val="bullet"/>
+      <w:lvlText w:val=""/>
+      <w:lvlJc w:val="left"/>
+      <w:pPr>
+        <w:tabs>
+          <w:tab w:val="num" w:pos="4320"/>
+        </w:tabs>
+        <w:ind w:left="4320" w:hanging="360"/>
+      </w:pPr>
+      <w:rPr>
+        <w:rFonts w:ascii="Wingdings" w:hAnsi="Wingdings" w:hint="default"/>
+        <w:sz w:val="20"/>
+      </w:rPr>
+    </w:lvl>
+    <w:lvl w:ilvl="6" w:tentative="1">
+      <w:start w:val="1"/>
+      <w:numFmt w:val="bullet"/>
+      <w:lvlText w:val=""/>
+      <w:lvlJc w:val="left"/>
+      <w:pPr>
+        <w:tabs>
+          <w:tab w:val="num" w:pos="5040"/>
+        </w:tabs>
+        <w:ind w:left="5040" w:hanging="360"/>
+      </w:pPr>
+      <w:rPr>
+        <w:rFonts w:ascii="Wingdings" w:hAnsi="Wingdings" w:hint="default"/>
+        <w:sz w:val="20"/>
+      </w:rPr>
+    </w:lvl>
+    <w:lvl w:ilvl="7" w:tentative="1">
+      <w:start w:val="1"/>
+      <w:numFmt w:val="bullet"/>
+      <w:lvlText w:val=""/>
+      <w:lvlJc w:val="left"/>
+      <w:pPr>
+        <w:tabs>
+          <w:tab w:val="num" w:pos="5760"/>
+        </w:tabs>
+        <w:ind w:left="5760" w:hanging="360"/>
+      </w:pPr>
+      <w:rPr>
+        <w:rFonts w:ascii="Wingdings" w:hAnsi="Wingdings" w:hint="default"/>
+        <w:sz w:val="20"/>
+      </w:rPr>
+    </w:lvl>
+    <w:lvl w:ilvl="8" w:tentative="1">
+      <w:start w:val="1"/>
+      <w:numFmt w:val="bullet"/>
+      <w:lvlText w:val=""/>
+      <w:lvlJc w:val="left"/>
+      <w:pPr>
+        <w:tabs>
+          <w:tab w:val="num" w:pos="6480"/>
+        </w:tabs>
+        <w:ind w:left="6480" w:hanging="360"/>
+      </w:pPr>
+      <w:rPr>
+        <w:rFonts w:ascii="Wingdings" w:hAnsi="Wingdings" w:hint="default"/>
+        <w:sz w:val="20"/>
+      </w:rPr>
+    </w:lvl>
+  </w:abstractNum>
+  <w:abstractNum w:abstractNumId="2">
+    <w:nsid w:val="0D786591"/>
+    <w:multiLevelType w:val="multilevel"/>
+    <w:tmpl w:val="4B7C4B7A"/>
+    <w:lvl w:ilvl="0">
+      <w:start w:val="1"/>
+      <w:numFmt w:val="bullet"/>
+      <w:lvlText w:val=""/>
+      <w:lvlJc w:val="left"/>
+      <w:pPr>
+        <w:tabs>
+          <w:tab w:val="num" w:pos="720"/>
+        </w:tabs>
+        <w:ind w:left="720" w:hanging="360"/>
+      </w:pPr>
+      <w:rPr>
+        <w:rFonts w:ascii="Symbol" w:hAnsi="Symbol" w:hint="default"/>
+        <w:sz w:val="20"/>
+      </w:rPr>
+    </w:lvl>
+    <w:lvl w:ilvl="1" w:tentative="1">
+      <w:start w:val="1"/>
+      <w:numFmt w:val="bullet"/>
+      <w:lvlText w:val="o"/>
+      <w:lvlJc w:val="left"/>
+      <w:pPr>
+        <w:tabs>
+          <w:tab w:val="num" w:pos="1440"/>
+        </w:tabs>
+        <w:ind w:left="1440" w:hanging="360"/>
+      </w:pPr>
+      <w:rPr>
+        <w:rFonts w:ascii="Courier New" w:hAnsi="Courier New" w:hint="default"/>
+        <w:sz w:val="20"/>
+      </w:rPr>
+    </w:lvl>
+    <w:lvl w:ilvl="2" w:tentative="1">
+      <w:start w:val="1"/>
+      <w:numFmt w:val="bullet"/>
+      <w:lvlText w:val=""/>
+      <w:lvlJc w:val="left"/>
+      <w:pPr>
+        <w:tabs>
+          <w:tab w:val="num" w:pos="2160"/>
+        </w:tabs>
+        <w:ind w:left="2160" w:hanging="360"/>
+      </w:pPr>
+      <w:rPr>
+        <w:rFonts w:ascii="Wingdings" w:hAnsi="Wingdings" w:hint="default"/>
+        <w:sz w:val="20"/>
+      </w:rPr>
+    </w:lvl>
+    <w:lvl w:ilvl="3" w:tentative="1">
+      <w:start w:val="1"/>
+      <w:numFmt w:val="bullet"/>
+      <w:lvlText w:val=""/>
+      <w:lvlJc w:val="left"/>
+      <w:pPr>
+        <w:tabs>
+          <w:tab w:val="num" w:pos="2880"/>
+        </w:tabs>
+        <w:ind w:left="2880" w:hanging="360"/>
+      </w:pPr>
+      <w:rPr>
+        <w:rFonts w:ascii="Wingdings" w:hAnsi="Wingdings" w:hint="default"/>
+        <w:sz w:val="20"/>
+      </w:rPr>
+    </w:lvl>
+    <w:lvl w:ilvl="4" w:tentative="1">
+      <w:start w:val="1"/>
+      <w:numFmt w:val="bullet"/>
+      <w:lvlText w:val=""/>
+      <w:lvlJc w:val="left"/>
+      <w:pPr>
+        <w:tabs>
+          <w:tab w:val="num" w:pos="3600"/>
+        </w:tabs>
+        <w:ind w:left="3600" w:hanging="360"/>
+      </w:pPr>
+      <w:rPr>
+        <w:rFonts w:ascii="Wingdings" w:hAnsi="Wingdings" w:hint="default"/>
+        <w:sz w:val="20"/>
+      </w:rPr>
+    </w:lvl>
+    <w:lvl w:ilvl="5" w:tentative="1">
+      <w:start w:val="1"/>
+      <w:numFmt w:val="bullet"/>
+      <w:lvlText w:val=""/>
+      <w:lvlJc w:val="left"/>
+      <w:pPr>
+        <w:tabs>
+          <w:tab w:val="num" w:pos="4320"/>
+        </w:tabs>
+        <w:ind w:left="4320" w:hanging="360"/>
+      </w:pPr>
+      <w:rPr>
+        <w:rFonts w:ascii="Wingdings" w:hAnsi="Wingdings" w:hint="default"/>
+        <w:sz w:val="20"/>
+      </w:rPr>
+    </w:lvl>
+    <w:lvl w:ilvl="6" w:tentative="1">
+      <w:start w:val="1"/>
+      <w:numFmt w:val="bullet"/>
+      <w:lvlText w:val=""/>
+      <w:lvlJc w:val="left"/>
+      <w:pPr>
+        <w:tabs>
+          <w:tab w:val="num" w:pos="5040"/>
+        </w:tabs>
+        <w:ind w:left="5040" w:hanging="360"/>
+      </w:pPr>
+      <w:rPr>
+        <w:rFonts w:ascii="Wingdings" w:hAnsi="Wingdings" w:hint="default"/>
+        <w:sz w:val="20"/>
+      </w:rPr>
+    </w:lvl>
+    <w:lvl w:ilvl="7" w:tentative="1">
+      <w:start w:val="1"/>
+      <w:numFmt w:val="bullet"/>
+      <w:lvlText w:val=""/>
+      <w:lvlJc w:val="left"/>
+      <w:pPr>
+        <w:tabs>
+          <w:tab w:val="num" w:pos="5760"/>
+        </w:tabs>
+        <w:ind w:left="5760" w:hanging="360"/>
+      </w:pPr>
+      <w:rPr>
+        <w:rFonts w:ascii="Wingdings" w:hAnsi="Wingdings" w:hint="default"/>
+        <w:sz w:val="20"/>
+      </w:rPr>
+    </w:lvl>
+    <w:lvl w:ilvl="8" w:tentative="1">
+      <w:start w:val="1"/>
+      <w:numFmt w:val="bullet"/>
+      <w:lvlText w:val=""/>
+      <w:lvlJc w:val="left"/>
+      <w:pPr>
+        <w:tabs>
+          <w:tab w:val="num" w:pos="6480"/>
+        </w:tabs>
+        <w:ind w:left="6480" w:hanging="360"/>
+      </w:pPr>
+      <w:rPr>
+        <w:rFonts w:ascii="Wingdings" w:hAnsi="Wingdings" w:hint="default"/>
+        <w:sz w:val="20"/>
+      </w:rPr>
+    </w:lvl>
+  </w:abstractNum>
+  <w:abstractNum w:abstractNumId="3">
+    <w:nsid w:val="0DD31552"/>
+    <w:multiLevelType w:val="multilevel"/>
+    <w:tmpl w:val="3DC2CED8"/>
+    <w:lvl w:ilvl="0">
+      <w:start w:val="1"/>
+      <w:numFmt w:val="bullet"/>
+      <w:lvlText w:val=""/>
+      <w:lvlJc w:val="left"/>
+      <w:pPr>
+        <w:tabs>
+          <w:tab w:val="num" w:pos="720"/>
+        </w:tabs>
+        <w:ind w:left="720" w:hanging="360"/>
+      </w:pPr>
+      <w:rPr>
+        <w:rFonts w:ascii="Symbol" w:hAnsi="Symbol" w:hint="default"/>
+        <w:sz w:val="20"/>
+      </w:rPr>
+    </w:lvl>
+    <w:lvl w:ilvl="1" w:tentative="1">
+      <w:start w:val="1"/>
+      <w:numFmt w:val="bullet"/>
+      <w:lvlText w:val="o"/>
+      <w:lvlJc w:val="left"/>
+      <w:pPr>
+        <w:tabs>
+          <w:tab w:val="num" w:pos="1440"/>
+        </w:tabs>
+        <w:ind w:left="1440" w:hanging="360"/>
+      </w:pPr>
+      <w:rPr>
+        <w:rFonts w:ascii="Courier New" w:hAnsi="Courier New" w:hint="default"/>
+        <w:sz w:val="20"/>
+      </w:rPr>
+    </w:lvl>
+    <w:lvl w:ilvl="2" w:tentative="1">
+      <w:start w:val="1"/>
+      <w:numFmt w:val="bullet"/>
+      <w:lvlText w:val=""/>
+      <w:lvlJc w:val="left"/>
+      <w:pPr>
+        <w:tabs>
+          <w:tab w:val="num" w:pos="2160"/>
+        </w:tabs>
+        <w:ind w:left="2160" w:hanging="360"/>
+      </w:pPr>
+      <w:rPr>
+        <w:rFonts w:ascii="Wingdings" w:hAnsi="Wingdings" w:hint="default"/>
+        <w:sz w:val="20"/>
+      </w:rPr>
+    </w:lvl>
+    <w:lvl w:ilvl="3" w:tentative="1">
+      <w:start w:val="1"/>
+      <w:numFmt w:val="bullet"/>
+      <w:lvlText w:val=""/>
+      <w:lvlJc w:val="left"/>
+      <w:pPr>
+        <w:tabs>
+          <w:tab w:val="num" w:pos="2880"/>
+        </w:tabs>
+        <w:ind w:left="2880" w:hanging="360"/>
+      </w:pPr>
+      <w:rPr>
+        <w:rFonts w:ascii="Wingdings" w:hAnsi="Wingdings" w:hint="default"/>
+        <w:sz w:val="20"/>
+      </w:rPr>
+    </w:lvl>
+    <w:lvl w:ilvl="4" w:tentative="1">
+      <w:start w:val="1"/>
+      <w:numFmt w:val="bullet"/>
+      <w:lvlText w:val=""/>
+      <w:lvlJc w:val="left"/>
+      <w:pPr>
+        <w:tabs>
+          <w:tab w:val="num" w:pos="3600"/>
+        </w:tabs>
+        <w:ind w:left="3600" w:hanging="360"/>
+      </w:pPr>
+      <w:rPr>
+        <w:rFonts w:ascii="Wingdings" w:hAnsi="Wingdings" w:hint="default"/>
+        <w:sz w:val="20"/>
+      </w:rPr>
+    </w:lvl>
+    <w:lvl w:ilvl="5" w:tentative="1">
+      <w:start w:val="1"/>
+      <w:numFmt w:val="bullet"/>
+      <w:lvlText w:val=""/>
+      <w:lvlJc w:val="left"/>
+      <w:pPr>
+        <w:tabs>
+          <w:tab w:val="num" w:pos="4320"/>
+        </w:tabs>
+        <w:ind w:left="4320" w:hanging="360"/>
+      </w:pPr>
+      <w:rPr>
+        <w:rFonts w:ascii="Wingdings" w:hAnsi="Wingdings" w:hint="default"/>
+        <w:sz w:val="20"/>
+      </w:rPr>
+    </w:lvl>
+    <w:lvl w:ilvl="6" w:tentative="1">
+      <w:start w:val="1"/>
+      <w:numFmt w:val="bullet"/>
+      <w:lvlText w:val=""/>
+      <w:lvlJc w:val="left"/>
+      <w:pPr>
+        <w:tabs>
+          <w:tab w:val="num" w:pos="5040"/>
+        </w:tabs>
+        <w:ind w:left="5040" w:hanging="360"/>
+      </w:pPr>
+      <w:rPr>
+        <w:rFonts w:ascii="Wingdings" w:hAnsi="Wingdings" w:hint="default"/>
+        <w:sz w:val="20"/>
+      </w:rPr>
+    </w:lvl>
+    <w:lvl w:ilvl="7" w:tentative="1">
+      <w:start w:val="1"/>
+      <w:numFmt w:val="bullet"/>
+      <w:lvlText w:val=""/>
+      <w:lvlJc w:val="left"/>
+      <w:pPr>
+        <w:tabs>
+          <w:tab w:val="num" w:pos="5760"/>
+        </w:tabs>
+        <w:ind w:left="5760" w:hanging="360"/>
+      </w:pPr>
+      <w:rPr>
+        <w:rFonts w:ascii="Wingdings" w:hAnsi="Wingdings" w:hint="default"/>
+        <w:sz w:val="20"/>
+      </w:rPr>
+    </w:lvl>
+    <w:lvl w:ilvl="8" w:tentative="1">
+      <w:start w:val="1"/>
+      <w:numFmt w:val="bullet"/>
+      <w:lvlText w:val=""/>
+      <w:lvlJc w:val="left"/>
+      <w:pPr>
+        <w:tabs>
+          <w:tab w:val="num" w:pos="6480"/>
+        </w:tabs>
+        <w:ind w:left="6480" w:hanging="360"/>
+      </w:pPr>
+      <w:rPr>
+        <w:rFonts w:ascii="Wingdings" w:hAnsi="Wingdings" w:hint="default"/>
+        <w:sz w:val="20"/>
+      </w:rPr>
+    </w:lvl>
+  </w:abstractNum>
+  <w:abstractNum w:abstractNumId="4">
+    <w:nsid w:val="0E13294A"/>
+    <w:multiLevelType w:val="multilevel"/>
+    <w:tmpl w:val="6186E8EC"/>
+    <w:lvl w:ilvl="0">
+      <w:start w:val="1"/>
+      <w:numFmt w:val="bullet"/>
+      <w:lvlText w:val=""/>
+      <w:lvlJc w:val="left"/>
+      <w:pPr>
+        <w:tabs>
+          <w:tab w:val="num" w:pos="720"/>
+        </w:tabs>
+        <w:ind w:left="720" w:hanging="360"/>
+      </w:pPr>
+      <w:rPr>
+        <w:rFonts w:ascii="Symbol" w:hAnsi="Symbol" w:hint="default"/>
+        <w:sz w:val="20"/>
+      </w:rPr>
+    </w:lvl>
+    <w:lvl w:ilvl="1" w:tentative="1">
+      <w:start w:val="1"/>
+      <w:numFmt w:val="bullet"/>
+      <w:lvlText w:val="o"/>
+      <w:lvlJc w:val="left"/>
+      <w:pPr>
+        <w:tabs>
+          <w:tab w:val="num" w:pos="1440"/>
+        </w:tabs>
+        <w:ind w:left="1440" w:hanging="360"/>
+      </w:pPr>
+      <w:rPr>
+        <w:rFonts w:ascii="Courier New" w:hAnsi="Courier New" w:hint="default"/>
+        <w:sz w:val="20"/>
+      </w:rPr>
+    </w:lvl>
+    <w:lvl w:ilvl="2" w:tentative="1">
+      <w:start w:val="1"/>
+      <w:numFmt w:val="bullet"/>
+      <w:lvlText w:val=""/>
+      <w:lvlJc w:val="left"/>
+      <w:pPr>
+        <w:tabs>
+          <w:tab w:val="num" w:pos="2160"/>
+        </w:tabs>
+        <w:ind w:left="2160" w:hanging="360"/>
+      </w:pPr>
+      <w:rPr>
+        <w:rFonts w:ascii="Wingdings" w:hAnsi="Wingdings" w:hint="default"/>
+        <w:sz w:val="20"/>
+      </w:rPr>
+    </w:lvl>
+    <w:lvl w:ilvl="3" w:tentative="1">
+      <w:start w:val="1"/>
+      <w:numFmt w:val="bullet"/>
+      <w:lvlText w:val=""/>
+      <w:lvlJc w:val="left"/>
+      <w:pPr>
+        <w:tabs>
+          <w:tab w:val="num" w:pos="2880"/>
+        </w:tabs>
+        <w:ind w:left="2880" w:hanging="360"/>
+      </w:pPr>
+      <w:rPr>
+        <w:rFonts w:ascii="Wingdings" w:hAnsi="Wingdings" w:hint="default"/>
+        <w:sz w:val="20"/>
+      </w:rPr>
+    </w:lvl>
+    <w:lvl w:ilvl="4" w:tentative="1">
+      <w:start w:val="1"/>
+      <w:numFmt w:val="bullet"/>
+      <w:lvlText w:val=""/>
+      <w:lvlJc w:val="left"/>
+      <w:pPr>
+        <w:tabs>
+          <w:tab w:val="num" w:pos="3600"/>
+        </w:tabs>
+        <w:ind w:left="3600" w:hanging="360"/>
+      </w:pPr>
+      <w:rPr>
+        <w:rFonts w:ascii="Wingdings" w:hAnsi="Wingdings" w:hint="default"/>
+        <w:sz w:val="20"/>
+      </w:rPr>
+    </w:lvl>
+    <w:lvl w:ilvl="5" w:tentative="1">
+      <w:start w:val="1"/>
+      <w:numFmt w:val="bullet"/>
+      <w:lvlText w:val=""/>
+      <w:lvlJc w:val="left"/>
+      <w:pPr>
+        <w:tabs>
+          <w:tab w:val="num" w:pos="4320"/>
+        </w:tabs>
+        <w:ind w:left="4320" w:hanging="360"/>
+      </w:pPr>
+      <w:rPr>
+        <w:rFonts w:ascii="Wingdings" w:hAnsi="Wingdings" w:hint="default"/>
+        <w:sz w:val="20"/>
+      </w:rPr>
+    </w:lvl>
+    <w:lvl w:ilvl="6" w:tentative="1">
+      <w:start w:val="1"/>
+      <w:numFmt w:val="bullet"/>
+      <w:lvlText w:val=""/>
+      <w:lvlJc w:val="left"/>
+      <w:pPr>
+        <w:tabs>
+          <w:tab w:val="num" w:pos="5040"/>
+        </w:tabs>
+        <w:ind w:left="5040" w:hanging="360"/>
+      </w:pPr>
+      <w:rPr>
+        <w:rFonts w:ascii="Wingdings" w:hAnsi="Wingdings" w:hint="default"/>
+        <w:sz w:val="20"/>
+      </w:rPr>
+    </w:lvl>
+    <w:lvl w:ilvl="7" w:tentative="1">
+      <w:start w:val="1"/>
+      <w:numFmt w:val="bullet"/>
+      <w:lvlText w:val=""/>
+      <w:lvlJc w:val="left"/>
+      <w:pPr>
+        <w:tabs>
+          <w:tab w:val="num" w:pos="5760"/>
+        </w:tabs>
+        <w:ind w:left="5760" w:hanging="360"/>
+      </w:pPr>
+      <w:rPr>
+        <w:rFonts w:ascii="Wingdings" w:hAnsi="Wingdings" w:hint="default"/>
+        <w:sz w:val="20"/>
+      </w:rPr>
+    </w:lvl>
+    <w:lvl w:ilvl="8" w:tentative="1">
+      <w:start w:val="1"/>
+      <w:numFmt w:val="bullet"/>
+      <w:lvlText w:val=""/>
+      <w:lvlJc w:val="left"/>
+      <w:pPr>
+        <w:tabs>
+          <w:tab w:val="num" w:pos="6480"/>
+        </w:tabs>
+        <w:ind w:left="6480" w:hanging="360"/>
+      </w:pPr>
+      <w:rPr>
+        <w:rFonts w:ascii="Wingdings" w:hAnsi="Wingdings" w:hint="default"/>
+        <w:sz w:val="20"/>
+      </w:rPr>
+    </w:lvl>
+  </w:abstractNum>
+  <w:abstractNum w:abstractNumId="5">
     <w:nsid w:val="2E7B6CF1"/>
     <w:multiLevelType w:val="hybridMultilevel"/>
     <w:tmpl w:val="9DF2DEC6"/>
@@ -2388,7 +3136,716 @@
       </w:pPr>
     </w:lvl>
   </w:abstractNum>
-  <w:abstractNum w:abstractNumId="1">
+  <w:abstractNum w:abstractNumId="6">
+    <w:nsid w:val="300E43FF"/>
+    <w:multiLevelType w:val="multilevel"/>
+    <w:tmpl w:val="9B92B102"/>
+    <w:lvl w:ilvl="0">
+      <w:start w:val="1"/>
+      <w:numFmt w:val="bullet"/>
+      <w:lvlText w:val=""/>
+      <w:lvlJc w:val="left"/>
+      <w:pPr>
+        <w:tabs>
+          <w:tab w:val="num" w:pos="720"/>
+        </w:tabs>
+        <w:ind w:left="720" w:hanging="360"/>
+      </w:pPr>
+      <w:rPr>
+        <w:rFonts w:ascii="Symbol" w:hAnsi="Symbol" w:hint="default"/>
+        <w:sz w:val="20"/>
+      </w:rPr>
+    </w:lvl>
+    <w:lvl w:ilvl="1" w:tentative="1">
+      <w:start w:val="1"/>
+      <w:numFmt w:val="bullet"/>
+      <w:lvlText w:val="o"/>
+      <w:lvlJc w:val="left"/>
+      <w:pPr>
+        <w:tabs>
+          <w:tab w:val="num" w:pos="1440"/>
+        </w:tabs>
+        <w:ind w:left="1440" w:hanging="360"/>
+      </w:pPr>
+      <w:rPr>
+        <w:rFonts w:ascii="Courier New" w:hAnsi="Courier New" w:hint="default"/>
+        <w:sz w:val="20"/>
+      </w:rPr>
+    </w:lvl>
+    <w:lvl w:ilvl="2" w:tentative="1">
+      <w:start w:val="1"/>
+      <w:numFmt w:val="bullet"/>
+      <w:lvlText w:val=""/>
+      <w:lvlJc w:val="left"/>
+      <w:pPr>
+        <w:tabs>
+          <w:tab w:val="num" w:pos="2160"/>
+        </w:tabs>
+        <w:ind w:left="2160" w:hanging="360"/>
+      </w:pPr>
+      <w:rPr>
+        <w:rFonts w:ascii="Wingdings" w:hAnsi="Wingdings" w:hint="default"/>
+        <w:sz w:val="20"/>
+      </w:rPr>
+    </w:lvl>
+    <w:lvl w:ilvl="3" w:tentative="1">
+      <w:start w:val="1"/>
+      <w:numFmt w:val="bullet"/>
+      <w:lvlText w:val=""/>
+      <w:lvlJc w:val="left"/>
+      <w:pPr>
+        <w:tabs>
+          <w:tab w:val="num" w:pos="2880"/>
+        </w:tabs>
+        <w:ind w:left="2880" w:hanging="360"/>
+      </w:pPr>
+      <w:rPr>
+        <w:rFonts w:ascii="Wingdings" w:hAnsi="Wingdings" w:hint="default"/>
+        <w:sz w:val="20"/>
+      </w:rPr>
+    </w:lvl>
+    <w:lvl w:ilvl="4" w:tentative="1">
+      <w:start w:val="1"/>
+      <w:numFmt w:val="bullet"/>
+      <w:lvlText w:val=""/>
+      <w:lvlJc w:val="left"/>
+      <w:pPr>
+        <w:tabs>
+          <w:tab w:val="num" w:pos="3600"/>
+        </w:tabs>
+        <w:ind w:left="3600" w:hanging="360"/>
+      </w:pPr>
+      <w:rPr>
+        <w:rFonts w:ascii="Wingdings" w:hAnsi="Wingdings" w:hint="default"/>
+        <w:sz w:val="20"/>
+      </w:rPr>
+    </w:lvl>
+    <w:lvl w:ilvl="5" w:tentative="1">
+      <w:start w:val="1"/>
+      <w:numFmt w:val="bullet"/>
+      <w:lvlText w:val=""/>
+      <w:lvlJc w:val="left"/>
+      <w:pPr>
+        <w:tabs>
+          <w:tab w:val="num" w:pos="4320"/>
+        </w:tabs>
+        <w:ind w:left="4320" w:hanging="360"/>
+      </w:pPr>
+      <w:rPr>
+        <w:rFonts w:ascii="Wingdings" w:hAnsi="Wingdings" w:hint="default"/>
+        <w:sz w:val="20"/>
+      </w:rPr>
+    </w:lvl>
+    <w:lvl w:ilvl="6" w:tentative="1">
+      <w:start w:val="1"/>
+      <w:numFmt w:val="bullet"/>
+      <w:lvlText w:val=""/>
+      <w:lvlJc w:val="left"/>
+      <w:pPr>
+        <w:tabs>
+          <w:tab w:val="num" w:pos="5040"/>
+        </w:tabs>
+        <w:ind w:left="5040" w:hanging="360"/>
+      </w:pPr>
+      <w:rPr>
+        <w:rFonts w:ascii="Wingdings" w:hAnsi="Wingdings" w:hint="default"/>
+        <w:sz w:val="20"/>
+      </w:rPr>
+    </w:lvl>
+    <w:lvl w:ilvl="7" w:tentative="1">
+      <w:start w:val="1"/>
+      <w:numFmt w:val="bullet"/>
+      <w:lvlText w:val=""/>
+      <w:lvlJc w:val="left"/>
+      <w:pPr>
+        <w:tabs>
+          <w:tab w:val="num" w:pos="5760"/>
+        </w:tabs>
+        <w:ind w:left="5760" w:hanging="360"/>
+      </w:pPr>
+      <w:rPr>
+        <w:rFonts w:ascii="Wingdings" w:hAnsi="Wingdings" w:hint="default"/>
+        <w:sz w:val="20"/>
+      </w:rPr>
+    </w:lvl>
+    <w:lvl w:ilvl="8" w:tentative="1">
+      <w:start w:val="1"/>
+      <w:numFmt w:val="bullet"/>
+      <w:lvlText w:val=""/>
+      <w:lvlJc w:val="left"/>
+      <w:pPr>
+        <w:tabs>
+          <w:tab w:val="num" w:pos="6480"/>
+        </w:tabs>
+        <w:ind w:left="6480" w:hanging="360"/>
+      </w:pPr>
+      <w:rPr>
+        <w:rFonts w:ascii="Wingdings" w:hAnsi="Wingdings" w:hint="default"/>
+        <w:sz w:val="20"/>
+      </w:rPr>
+    </w:lvl>
+  </w:abstractNum>
+  <w:abstractNum w:abstractNumId="7">
+    <w:nsid w:val="34902983"/>
+    <w:multiLevelType w:val="multilevel"/>
+    <w:tmpl w:val="7764AA94"/>
+    <w:lvl w:ilvl="0">
+      <w:start w:val="1"/>
+      <w:numFmt w:val="decimal"/>
+      <w:lvlText w:val="%1."/>
+      <w:lvlJc w:val="left"/>
+      <w:pPr>
+        <w:tabs>
+          <w:tab w:val="num" w:pos="720"/>
+        </w:tabs>
+        <w:ind w:left="720" w:hanging="360"/>
+      </w:pPr>
+    </w:lvl>
+    <w:lvl w:ilvl="1" w:tentative="1">
+      <w:start w:val="1"/>
+      <w:numFmt w:val="decimal"/>
+      <w:lvlText w:val="%2."/>
+      <w:lvlJc w:val="left"/>
+      <w:pPr>
+        <w:tabs>
+          <w:tab w:val="num" w:pos="1440"/>
+        </w:tabs>
+        <w:ind w:left="1440" w:hanging="360"/>
+      </w:pPr>
+    </w:lvl>
+    <w:lvl w:ilvl="2" w:tentative="1">
+      <w:start w:val="1"/>
+      <w:numFmt w:val="decimal"/>
+      <w:lvlText w:val="%3."/>
+      <w:lvlJc w:val="left"/>
+      <w:pPr>
+        <w:tabs>
+          <w:tab w:val="num" w:pos="2160"/>
+        </w:tabs>
+        <w:ind w:left="2160" w:hanging="360"/>
+      </w:pPr>
+    </w:lvl>
+    <w:lvl w:ilvl="3" w:tentative="1">
+      <w:start w:val="1"/>
+      <w:numFmt w:val="decimal"/>
+      <w:lvlText w:val="%4."/>
+      <w:lvlJc w:val="left"/>
+      <w:pPr>
+        <w:tabs>
+          <w:tab w:val="num" w:pos="2880"/>
+        </w:tabs>
+        <w:ind w:left="2880" w:hanging="360"/>
+      </w:pPr>
+    </w:lvl>
+    <w:lvl w:ilvl="4" w:tentative="1">
+      <w:start w:val="1"/>
+      <w:numFmt w:val="decimal"/>
+      <w:lvlText w:val="%5."/>
+      <w:lvlJc w:val="left"/>
+      <w:pPr>
+        <w:tabs>
+          <w:tab w:val="num" w:pos="3600"/>
+        </w:tabs>
+        <w:ind w:left="3600" w:hanging="360"/>
+      </w:pPr>
+    </w:lvl>
+    <w:lvl w:ilvl="5" w:tentative="1">
+      <w:start w:val="1"/>
+      <w:numFmt w:val="decimal"/>
+      <w:lvlText w:val="%6."/>
+      <w:lvlJc w:val="left"/>
+      <w:pPr>
+        <w:tabs>
+          <w:tab w:val="num" w:pos="4320"/>
+        </w:tabs>
+        <w:ind w:left="4320" w:hanging="360"/>
+      </w:pPr>
+    </w:lvl>
+    <w:lvl w:ilvl="6" w:tentative="1">
+      <w:start w:val="1"/>
+      <w:numFmt w:val="decimal"/>
+      <w:lvlText w:val="%7."/>
+      <w:lvlJc w:val="left"/>
+      <w:pPr>
+        <w:tabs>
+          <w:tab w:val="num" w:pos="5040"/>
+        </w:tabs>
+        <w:ind w:left="5040" w:hanging="360"/>
+      </w:pPr>
+    </w:lvl>
+    <w:lvl w:ilvl="7" w:tentative="1">
+      <w:start w:val="1"/>
+      <w:numFmt w:val="decimal"/>
+      <w:lvlText w:val="%8."/>
+      <w:lvlJc w:val="left"/>
+      <w:pPr>
+        <w:tabs>
+          <w:tab w:val="num" w:pos="5760"/>
+        </w:tabs>
+        <w:ind w:left="5760" w:hanging="360"/>
+      </w:pPr>
+    </w:lvl>
+    <w:lvl w:ilvl="8" w:tentative="1">
+      <w:start w:val="1"/>
+      <w:numFmt w:val="decimal"/>
+      <w:lvlText w:val="%9."/>
+      <w:lvlJc w:val="left"/>
+      <w:pPr>
+        <w:tabs>
+          <w:tab w:val="num" w:pos="6480"/>
+        </w:tabs>
+        <w:ind w:left="6480" w:hanging="360"/>
+      </w:pPr>
+    </w:lvl>
+  </w:abstractNum>
+  <w:abstractNum w:abstractNumId="8">
+    <w:nsid w:val="407057C9"/>
+    <w:multiLevelType w:val="multilevel"/>
+    <w:tmpl w:val="1C462CEA"/>
+    <w:lvl w:ilvl="0">
+      <w:start w:val="1"/>
+      <w:numFmt w:val="bullet"/>
+      <w:lvlText w:val=""/>
+      <w:lvlJc w:val="left"/>
+      <w:pPr>
+        <w:tabs>
+          <w:tab w:val="num" w:pos="720"/>
+        </w:tabs>
+        <w:ind w:left="720" w:hanging="360"/>
+      </w:pPr>
+      <w:rPr>
+        <w:rFonts w:ascii="Symbol" w:hAnsi="Symbol" w:hint="default"/>
+        <w:sz w:val="20"/>
+      </w:rPr>
+    </w:lvl>
+    <w:lvl w:ilvl="1" w:tentative="1">
+      <w:start w:val="1"/>
+      <w:numFmt w:val="bullet"/>
+      <w:lvlText w:val="o"/>
+      <w:lvlJc w:val="left"/>
+      <w:pPr>
+        <w:tabs>
+          <w:tab w:val="num" w:pos="1440"/>
+        </w:tabs>
+        <w:ind w:left="1440" w:hanging="360"/>
+      </w:pPr>
+      <w:rPr>
+        <w:rFonts w:ascii="Courier New" w:hAnsi="Courier New" w:hint="default"/>
+        <w:sz w:val="20"/>
+      </w:rPr>
+    </w:lvl>
+    <w:lvl w:ilvl="2" w:tentative="1">
+      <w:start w:val="1"/>
+      <w:numFmt w:val="bullet"/>
+      <w:lvlText w:val=""/>
+      <w:lvlJc w:val="left"/>
+      <w:pPr>
+        <w:tabs>
+          <w:tab w:val="num" w:pos="2160"/>
+        </w:tabs>
+        <w:ind w:left="2160" w:hanging="360"/>
+      </w:pPr>
+      <w:rPr>
+        <w:rFonts w:ascii="Wingdings" w:hAnsi="Wingdings" w:hint="default"/>
+        <w:sz w:val="20"/>
+      </w:rPr>
+    </w:lvl>
+    <w:lvl w:ilvl="3" w:tentative="1">
+      <w:start w:val="1"/>
+      <w:numFmt w:val="bullet"/>
+      <w:lvlText w:val=""/>
+      <w:lvlJc w:val="left"/>
+      <w:pPr>
+        <w:tabs>
+          <w:tab w:val="num" w:pos="2880"/>
+        </w:tabs>
+        <w:ind w:left="2880" w:hanging="360"/>
+      </w:pPr>
+      <w:rPr>
+        <w:rFonts w:ascii="Wingdings" w:hAnsi="Wingdings" w:hint="default"/>
+        <w:sz w:val="20"/>
+      </w:rPr>
+    </w:lvl>
+    <w:lvl w:ilvl="4" w:tentative="1">
+      <w:start w:val="1"/>
+      <w:numFmt w:val="bullet"/>
+      <w:lvlText w:val=""/>
+      <w:lvlJc w:val="left"/>
+      <w:pPr>
+        <w:tabs>
+          <w:tab w:val="num" w:pos="3600"/>
+        </w:tabs>
+        <w:ind w:left="3600" w:hanging="360"/>
+      </w:pPr>
+      <w:rPr>
+        <w:rFonts w:ascii="Wingdings" w:hAnsi="Wingdings" w:hint="default"/>
+        <w:sz w:val="20"/>
+      </w:rPr>
+    </w:lvl>
+    <w:lvl w:ilvl="5" w:tentative="1">
+      <w:start w:val="1"/>
+      <w:numFmt w:val="bullet"/>
+      <w:lvlText w:val=""/>
+      <w:lvlJc w:val="left"/>
+      <w:pPr>
+        <w:tabs>
+          <w:tab w:val="num" w:pos="4320"/>
+        </w:tabs>
+        <w:ind w:left="4320" w:hanging="360"/>
+      </w:pPr>
+      <w:rPr>
+        <w:rFonts w:ascii="Wingdings" w:hAnsi="Wingdings" w:hint="default"/>
+        <w:sz w:val="20"/>
+      </w:rPr>
+    </w:lvl>
+    <w:lvl w:ilvl="6" w:tentative="1">
+      <w:start w:val="1"/>
+      <w:numFmt w:val="bullet"/>
+      <w:lvlText w:val=""/>
+      <w:lvlJc w:val="left"/>
+      <w:pPr>
+        <w:tabs>
+          <w:tab w:val="num" w:pos="5040"/>
+        </w:tabs>
+        <w:ind w:left="5040" w:hanging="360"/>
+      </w:pPr>
+      <w:rPr>
+        <w:rFonts w:ascii="Wingdings" w:hAnsi="Wingdings" w:hint="default"/>
+        <w:sz w:val="20"/>
+      </w:rPr>
+    </w:lvl>
+    <w:lvl w:ilvl="7" w:tentative="1">
+      <w:start w:val="1"/>
+      <w:numFmt w:val="bullet"/>
+      <w:lvlText w:val=""/>
+      <w:lvlJc w:val="left"/>
+      <w:pPr>
+        <w:tabs>
+          <w:tab w:val="num" w:pos="5760"/>
+        </w:tabs>
+        <w:ind w:left="5760" w:hanging="360"/>
+      </w:pPr>
+      <w:rPr>
+        <w:rFonts w:ascii="Wingdings" w:hAnsi="Wingdings" w:hint="default"/>
+        <w:sz w:val="20"/>
+      </w:rPr>
+    </w:lvl>
+    <w:lvl w:ilvl="8" w:tentative="1">
+      <w:start w:val="1"/>
+      <w:numFmt w:val="bullet"/>
+      <w:lvlText w:val=""/>
+      <w:lvlJc w:val="left"/>
+      <w:pPr>
+        <w:tabs>
+          <w:tab w:val="num" w:pos="6480"/>
+        </w:tabs>
+        <w:ind w:left="6480" w:hanging="360"/>
+      </w:pPr>
+      <w:rPr>
+        <w:rFonts w:ascii="Wingdings" w:hAnsi="Wingdings" w:hint="default"/>
+        <w:sz w:val="20"/>
+      </w:rPr>
+    </w:lvl>
+  </w:abstractNum>
+  <w:abstractNum w:abstractNumId="9">
+    <w:nsid w:val="41120EB9"/>
+    <w:multiLevelType w:val="multilevel"/>
+    <w:tmpl w:val="1624C3BE"/>
+    <w:lvl w:ilvl="0">
+      <w:start w:val="1"/>
+      <w:numFmt w:val="bullet"/>
+      <w:lvlText w:val=""/>
+      <w:lvlJc w:val="left"/>
+      <w:pPr>
+        <w:tabs>
+          <w:tab w:val="num" w:pos="720"/>
+        </w:tabs>
+        <w:ind w:left="720" w:hanging="360"/>
+      </w:pPr>
+      <w:rPr>
+        <w:rFonts w:ascii="Symbol" w:hAnsi="Symbol" w:hint="default"/>
+        <w:sz w:val="20"/>
+      </w:rPr>
+    </w:lvl>
+    <w:lvl w:ilvl="1" w:tentative="1">
+      <w:start w:val="1"/>
+      <w:numFmt w:val="bullet"/>
+      <w:lvlText w:val="o"/>
+      <w:lvlJc w:val="left"/>
+      <w:pPr>
+        <w:tabs>
+          <w:tab w:val="num" w:pos="1440"/>
+        </w:tabs>
+        <w:ind w:left="1440" w:hanging="360"/>
+      </w:pPr>
+      <w:rPr>
+        <w:rFonts w:ascii="Courier New" w:hAnsi="Courier New" w:hint="default"/>
+        <w:sz w:val="20"/>
+      </w:rPr>
+    </w:lvl>
+    <w:lvl w:ilvl="2" w:tentative="1">
+      <w:start w:val="1"/>
+      <w:numFmt w:val="bullet"/>
+      <w:lvlText w:val=""/>
+      <w:lvlJc w:val="left"/>
+      <w:pPr>
+        <w:tabs>
+          <w:tab w:val="num" w:pos="2160"/>
+        </w:tabs>
+        <w:ind w:left="2160" w:hanging="360"/>
+      </w:pPr>
+      <w:rPr>
+        <w:rFonts w:ascii="Wingdings" w:hAnsi="Wingdings" w:hint="default"/>
+        <w:sz w:val="20"/>
+      </w:rPr>
+    </w:lvl>
+    <w:lvl w:ilvl="3" w:tentative="1">
+      <w:start w:val="1"/>
+      <w:numFmt w:val="bullet"/>
+      <w:lvlText w:val=""/>
+      <w:lvlJc w:val="left"/>
+      <w:pPr>
+        <w:tabs>
+          <w:tab w:val="num" w:pos="2880"/>
+        </w:tabs>
+        <w:ind w:left="2880" w:hanging="360"/>
+      </w:pPr>
+      <w:rPr>
+        <w:rFonts w:ascii="Wingdings" w:hAnsi="Wingdings" w:hint="default"/>
+        <w:sz w:val="20"/>
+      </w:rPr>
+    </w:lvl>
+    <w:lvl w:ilvl="4" w:tentative="1">
+      <w:start w:val="1"/>
+      <w:numFmt w:val="bullet"/>
+      <w:lvlText w:val=""/>
+      <w:lvlJc w:val="left"/>
+      <w:pPr>
+        <w:tabs>
+          <w:tab w:val="num" w:pos="3600"/>
+        </w:tabs>
+        <w:ind w:left="3600" w:hanging="360"/>
+      </w:pPr>
+      <w:rPr>
+        <w:rFonts w:ascii="Wingdings" w:hAnsi="Wingdings" w:hint="default"/>
+        <w:sz w:val="20"/>
+      </w:rPr>
+    </w:lvl>
+    <w:lvl w:ilvl="5" w:tentative="1">
+      <w:start w:val="1"/>
+      <w:numFmt w:val="bullet"/>
+      <w:lvlText w:val=""/>
+      <w:lvlJc w:val="left"/>
+      <w:pPr>
+        <w:tabs>
+          <w:tab w:val="num" w:pos="4320"/>
+        </w:tabs>
+        <w:ind w:left="4320" w:hanging="360"/>
+      </w:pPr>
+      <w:rPr>
+        <w:rFonts w:ascii="Wingdings" w:hAnsi="Wingdings" w:hint="default"/>
+        <w:sz w:val="20"/>
+      </w:rPr>
+    </w:lvl>
+    <w:lvl w:ilvl="6" w:tentative="1">
+      <w:start w:val="1"/>
+      <w:numFmt w:val="bullet"/>
+      <w:lvlText w:val=""/>
+      <w:lvlJc w:val="left"/>
+      <w:pPr>
+        <w:tabs>
+          <w:tab w:val="num" w:pos="5040"/>
+        </w:tabs>
+        <w:ind w:left="5040" w:hanging="360"/>
+      </w:pPr>
+      <w:rPr>
+        <w:rFonts w:ascii="Wingdings" w:hAnsi="Wingdings" w:hint="default"/>
+        <w:sz w:val="20"/>
+      </w:rPr>
+    </w:lvl>
+    <w:lvl w:ilvl="7" w:tentative="1">
+      <w:start w:val="1"/>
+      <w:numFmt w:val="bullet"/>
+      <w:lvlText w:val=""/>
+      <w:lvlJc w:val="left"/>
+      <w:pPr>
+        <w:tabs>
+          <w:tab w:val="num" w:pos="5760"/>
+        </w:tabs>
+        <w:ind w:left="5760" w:hanging="360"/>
+      </w:pPr>
+      <w:rPr>
+        <w:rFonts w:ascii="Wingdings" w:hAnsi="Wingdings" w:hint="default"/>
+        <w:sz w:val="20"/>
+      </w:rPr>
+    </w:lvl>
+    <w:lvl w:ilvl="8" w:tentative="1">
+      <w:start w:val="1"/>
+      <w:numFmt w:val="bullet"/>
+      <w:lvlText w:val=""/>
+      <w:lvlJc w:val="left"/>
+      <w:pPr>
+        <w:tabs>
+          <w:tab w:val="num" w:pos="6480"/>
+        </w:tabs>
+        <w:ind w:left="6480" w:hanging="360"/>
+      </w:pPr>
+      <w:rPr>
+        <w:rFonts w:ascii="Wingdings" w:hAnsi="Wingdings" w:hint="default"/>
+        <w:sz w:val="20"/>
+      </w:rPr>
+    </w:lvl>
+  </w:abstractNum>
+  <w:abstractNum w:abstractNumId="10">
+    <w:nsid w:val="4FDF6C62"/>
+    <w:multiLevelType w:val="multilevel"/>
+    <w:tmpl w:val="68A4B2CC"/>
+    <w:lvl w:ilvl="0">
+      <w:start w:val="1"/>
+      <w:numFmt w:val="bullet"/>
+      <w:lvlText w:val=""/>
+      <w:lvlJc w:val="left"/>
+      <w:pPr>
+        <w:tabs>
+          <w:tab w:val="num" w:pos="720"/>
+        </w:tabs>
+        <w:ind w:left="720" w:hanging="360"/>
+      </w:pPr>
+      <w:rPr>
+        <w:rFonts w:ascii="Symbol" w:hAnsi="Symbol" w:hint="default"/>
+        <w:sz w:val="20"/>
+      </w:rPr>
+    </w:lvl>
+    <w:lvl w:ilvl="1" w:tentative="1">
+      <w:start w:val="1"/>
+      <w:numFmt w:val="bullet"/>
+      <w:lvlText w:val="o"/>
+      <w:lvlJc w:val="left"/>
+      <w:pPr>
+        <w:tabs>
+          <w:tab w:val="num" w:pos="1440"/>
+        </w:tabs>
+        <w:ind w:left="1440" w:hanging="360"/>
+      </w:pPr>
+      <w:rPr>
+        <w:rFonts w:ascii="Courier New" w:hAnsi="Courier New" w:hint="default"/>
+        <w:sz w:val="20"/>
+      </w:rPr>
+    </w:lvl>
+    <w:lvl w:ilvl="2" w:tentative="1">
+      <w:start w:val="1"/>
+      <w:numFmt w:val="bullet"/>
+      <w:lvlText w:val=""/>
+      <w:lvlJc w:val="left"/>
+      <w:pPr>
+        <w:tabs>
+          <w:tab w:val="num" w:pos="2160"/>
+        </w:tabs>
+        <w:ind w:left="2160" w:hanging="360"/>
+      </w:pPr>
+      <w:rPr>
+        <w:rFonts w:ascii="Wingdings" w:hAnsi="Wingdings" w:hint="default"/>
+        <w:sz w:val="20"/>
+      </w:rPr>
+    </w:lvl>
+    <w:lvl w:ilvl="3" w:tentative="1">
+      <w:start w:val="1"/>
+      <w:numFmt w:val="bullet"/>
+      <w:lvlText w:val=""/>
+      <w:lvlJc w:val="left"/>
+      <w:pPr>
+        <w:tabs>
+          <w:tab w:val="num" w:pos="2880"/>
+        </w:tabs>
+        <w:ind w:left="2880" w:hanging="360"/>
+      </w:pPr>
+      <w:rPr>
+        <w:rFonts w:ascii="Wingdings" w:hAnsi="Wingdings" w:hint="default"/>
+        <w:sz w:val="20"/>
+      </w:rPr>
+    </w:lvl>
+    <w:lvl w:ilvl="4" w:tentative="1">
+      <w:start w:val="1"/>
+      <w:numFmt w:val="bullet"/>
+      <w:lvlText w:val=""/>
+      <w:lvlJc w:val="left"/>
+      <w:pPr>
+        <w:tabs>
+          <w:tab w:val="num" w:pos="3600"/>
+        </w:tabs>
+        <w:ind w:left="3600" w:hanging="360"/>
+      </w:pPr>
+      <w:rPr>
+        <w:rFonts w:ascii="Wingdings" w:hAnsi="Wingdings" w:hint="default"/>
+        <w:sz w:val="20"/>
+      </w:rPr>
+    </w:lvl>
+    <w:lvl w:ilvl="5" w:tentative="1">
+      <w:start w:val="1"/>
+      <w:numFmt w:val="bullet"/>
+      <w:lvlText w:val=""/>
+      <w:lvlJc w:val="left"/>
+      <w:pPr>
+        <w:tabs>
+          <w:tab w:val="num" w:pos="4320"/>
+        </w:tabs>
+        <w:ind w:left="4320" w:hanging="360"/>
+      </w:pPr>
+      <w:rPr>
+        <w:rFonts w:ascii="Wingdings" w:hAnsi="Wingdings" w:hint="default"/>
+        <w:sz w:val="20"/>
+      </w:rPr>
+    </w:lvl>
+    <w:lvl w:ilvl="6" w:tentative="1">
+      <w:start w:val="1"/>
+      <w:numFmt w:val="bullet"/>
+      <w:lvlText w:val=""/>
+      <w:lvlJc w:val="left"/>
+      <w:pPr>
+        <w:tabs>
+          <w:tab w:val="num" w:pos="5040"/>
+        </w:tabs>
+        <w:ind w:left="5040" w:hanging="360"/>
+      </w:pPr>
+      <w:rPr>
+        <w:rFonts w:ascii="Wingdings" w:hAnsi="Wingdings" w:hint="default"/>
+        <w:sz w:val="20"/>
+      </w:rPr>
+    </w:lvl>
+    <w:lvl w:ilvl="7" w:tentative="1">
+      <w:start w:val="1"/>
+      <w:numFmt w:val="bullet"/>
+      <w:lvlText w:val=""/>
+      <w:lvlJc w:val="left"/>
+      <w:pPr>
+        <w:tabs>
+          <w:tab w:val="num" w:pos="5760"/>
+        </w:tabs>
+        <w:ind w:left="5760" w:hanging="360"/>
+      </w:pPr>
+      <w:rPr>
+        <w:rFonts w:ascii="Wingdings" w:hAnsi="Wingdings" w:hint="default"/>
+        <w:sz w:val="20"/>
+      </w:rPr>
+    </w:lvl>
+    <w:lvl w:ilvl="8" w:tentative="1">
+      <w:start w:val="1"/>
+      <w:numFmt w:val="bullet"/>
+      <w:lvlText w:val=""/>
+      <w:lvlJc w:val="left"/>
+      <w:pPr>
+        <w:tabs>
+          <w:tab w:val="num" w:pos="6480"/>
+        </w:tabs>
+        <w:ind w:left="6480" w:hanging="360"/>
+      </w:pPr>
+      <w:rPr>
+        <w:rFonts w:ascii="Wingdings" w:hAnsi="Wingdings" w:hint="default"/>
+        <w:sz w:val="20"/>
+      </w:rPr>
+    </w:lvl>
+  </w:abstractNum>
+  <w:abstractNum w:abstractNumId="11">
     <w:nsid w:val="5C0A2EE7"/>
     <w:multiLevelType w:val="hybridMultilevel"/>
     <w:tmpl w:val="1514EB6E"/>
@@ -2501,7 +3958,156 @@
       </w:rPr>
     </w:lvl>
   </w:abstractNum>
-  <w:abstractNum w:abstractNumId="2">
+  <w:abstractNum w:abstractNumId="12">
+    <w:nsid w:val="5C7F47C5"/>
+    <w:multiLevelType w:val="multilevel"/>
+    <w:tmpl w:val="4C2215E0"/>
+    <w:lvl w:ilvl="0">
+      <w:start w:val="1"/>
+      <w:numFmt w:val="bullet"/>
+      <w:lvlText w:val=""/>
+      <w:lvlJc w:val="left"/>
+      <w:pPr>
+        <w:tabs>
+          <w:tab w:val="num" w:pos="720"/>
+        </w:tabs>
+        <w:ind w:left="720" w:hanging="360"/>
+      </w:pPr>
+      <w:rPr>
+        <w:rFonts w:ascii="Symbol" w:hAnsi="Symbol" w:hint="default"/>
+        <w:sz w:val="20"/>
+      </w:rPr>
+    </w:lvl>
+    <w:lvl w:ilvl="1" w:tentative="1">
+      <w:start w:val="1"/>
+      <w:numFmt w:val="bullet"/>
+      <w:lvlText w:val="o"/>
+      <w:lvlJc w:val="left"/>
+      <w:pPr>
+        <w:tabs>
+          <w:tab w:val="num" w:pos="1440"/>
+        </w:tabs>
+        <w:ind w:left="1440" w:hanging="360"/>
+      </w:pPr>
+      <w:rPr>
+        <w:rFonts w:ascii="Courier New" w:hAnsi="Courier New" w:hint="default"/>
+        <w:sz w:val="20"/>
+      </w:rPr>
+    </w:lvl>
+    <w:lvl w:ilvl="2" w:tentative="1">
+      <w:start w:val="1"/>
+      <w:numFmt w:val="bullet"/>
+      <w:lvlText w:val=""/>
+      <w:lvlJc w:val="left"/>
+      <w:pPr>
+        <w:tabs>
+          <w:tab w:val="num" w:pos="2160"/>
+        </w:tabs>
+        <w:ind w:left="2160" w:hanging="360"/>
+      </w:pPr>
+      <w:rPr>
+        <w:rFonts w:ascii="Wingdings" w:hAnsi="Wingdings" w:hint="default"/>
+        <w:sz w:val="20"/>
+      </w:rPr>
+    </w:lvl>
+    <w:lvl w:ilvl="3" w:tentative="1">
+      <w:start w:val="1"/>
+      <w:numFmt w:val="bullet"/>
+      <w:lvlText w:val=""/>
+      <w:lvlJc w:val="left"/>
+      <w:pPr>
+        <w:tabs>
+          <w:tab w:val="num" w:pos="2880"/>
+        </w:tabs>
+        <w:ind w:left="2880" w:hanging="360"/>
+      </w:pPr>
+      <w:rPr>
+        <w:rFonts w:ascii="Wingdings" w:hAnsi="Wingdings" w:hint="default"/>
+        <w:sz w:val="20"/>
+      </w:rPr>
+    </w:lvl>
+    <w:lvl w:ilvl="4" w:tentative="1">
+      <w:start w:val="1"/>
+      <w:numFmt w:val="bullet"/>
+      <w:lvlText w:val=""/>
+      <w:lvlJc w:val="left"/>
+      <w:pPr>
+        <w:tabs>
+          <w:tab w:val="num" w:pos="3600"/>
+        </w:tabs>
+        <w:ind w:left="3600" w:hanging="360"/>
+      </w:pPr>
+      <w:rPr>
+        <w:rFonts w:ascii="Wingdings" w:hAnsi="Wingdings" w:hint="default"/>
+        <w:sz w:val="20"/>
+      </w:rPr>
+    </w:lvl>
+    <w:lvl w:ilvl="5" w:tentative="1">
+      <w:start w:val="1"/>
+      <w:numFmt w:val="bullet"/>
+      <w:lvlText w:val=""/>
+      <w:lvlJc w:val="left"/>
+      <w:pPr>
+        <w:tabs>
+          <w:tab w:val="num" w:pos="4320"/>
+        </w:tabs>
+        <w:ind w:left="4320" w:hanging="360"/>
+      </w:pPr>
+      <w:rPr>
+        <w:rFonts w:ascii="Wingdings" w:hAnsi="Wingdings" w:hint="default"/>
+        <w:sz w:val="20"/>
+      </w:rPr>
+    </w:lvl>
+    <w:lvl w:ilvl="6" w:tentative="1">
+      <w:start w:val="1"/>
+      <w:numFmt w:val="bullet"/>
+      <w:lvlText w:val=""/>
+      <w:lvlJc w:val="left"/>
+      <w:pPr>
+        <w:tabs>
+          <w:tab w:val="num" w:pos="5040"/>
+        </w:tabs>
+        <w:ind w:left="5040" w:hanging="360"/>
+      </w:pPr>
+      <w:rPr>
+        <w:rFonts w:ascii="Wingdings" w:hAnsi="Wingdings" w:hint="default"/>
+        <w:sz w:val="20"/>
+      </w:rPr>
+    </w:lvl>
+    <w:lvl w:ilvl="7" w:tentative="1">
+      <w:start w:val="1"/>
+      <w:numFmt w:val="bullet"/>
+      <w:lvlText w:val=""/>
+      <w:lvlJc w:val="left"/>
+      <w:pPr>
+        <w:tabs>
+          <w:tab w:val="num" w:pos="5760"/>
+        </w:tabs>
+        <w:ind w:left="5760" w:hanging="360"/>
+      </w:pPr>
+      <w:rPr>
+        <w:rFonts w:ascii="Wingdings" w:hAnsi="Wingdings" w:hint="default"/>
+        <w:sz w:val="20"/>
+      </w:rPr>
+    </w:lvl>
+    <w:lvl w:ilvl="8" w:tentative="1">
+      <w:start w:val="1"/>
+      <w:numFmt w:val="bullet"/>
+      <w:lvlText w:val=""/>
+      <w:lvlJc w:val="left"/>
+      <w:pPr>
+        <w:tabs>
+          <w:tab w:val="num" w:pos="6480"/>
+        </w:tabs>
+        <w:ind w:left="6480" w:hanging="360"/>
+      </w:pPr>
+      <w:rPr>
+        <w:rFonts w:ascii="Wingdings" w:hAnsi="Wingdings" w:hint="default"/>
+        <w:sz w:val="20"/>
+      </w:rPr>
+    </w:lvl>
+  </w:abstractNum>
+  <w:abstractNum w:abstractNumId="13">
     <w:nsid w:val="625644B7"/>
     <w:multiLevelType w:val="multilevel"/>
     <w:tmpl w:val="ADB45E06"/>
@@ -2650,14 +4256,351 @@
       </w:rPr>
     </w:lvl>
   </w:abstractNum>
+  <w:abstractNum w:abstractNumId="14">
+    <w:nsid w:val="6314476A"/>
+    <w:multiLevelType w:val="multilevel"/>
+    <w:tmpl w:val="FD1CD778"/>
+    <w:lvl w:ilvl="0">
+      <w:start w:val="1"/>
+      <w:numFmt w:val="bullet"/>
+      <w:lvlText w:val=""/>
+      <w:lvlJc w:val="left"/>
+      <w:pPr>
+        <w:tabs>
+          <w:tab w:val="num" w:pos="720"/>
+        </w:tabs>
+        <w:ind w:left="720" w:hanging="360"/>
+      </w:pPr>
+      <w:rPr>
+        <w:rFonts w:ascii="Symbol" w:hAnsi="Symbol" w:hint="default"/>
+        <w:sz w:val="20"/>
+      </w:rPr>
+    </w:lvl>
+    <w:lvl w:ilvl="1" w:tentative="1">
+      <w:start w:val="1"/>
+      <w:numFmt w:val="bullet"/>
+      <w:lvlText w:val="o"/>
+      <w:lvlJc w:val="left"/>
+      <w:pPr>
+        <w:tabs>
+          <w:tab w:val="num" w:pos="1440"/>
+        </w:tabs>
+        <w:ind w:left="1440" w:hanging="360"/>
+      </w:pPr>
+      <w:rPr>
+        <w:rFonts w:ascii="Courier New" w:hAnsi="Courier New" w:hint="default"/>
+        <w:sz w:val="20"/>
+      </w:rPr>
+    </w:lvl>
+    <w:lvl w:ilvl="2" w:tentative="1">
+      <w:start w:val="1"/>
+      <w:numFmt w:val="bullet"/>
+      <w:lvlText w:val=""/>
+      <w:lvlJc w:val="left"/>
+      <w:pPr>
+        <w:tabs>
+          <w:tab w:val="num" w:pos="2160"/>
+        </w:tabs>
+        <w:ind w:left="2160" w:hanging="360"/>
+      </w:pPr>
+      <w:rPr>
+        <w:rFonts w:ascii="Wingdings" w:hAnsi="Wingdings" w:hint="default"/>
+        <w:sz w:val="20"/>
+      </w:rPr>
+    </w:lvl>
+    <w:lvl w:ilvl="3" w:tentative="1">
+      <w:start w:val="1"/>
+      <w:numFmt w:val="bullet"/>
+      <w:lvlText w:val=""/>
+      <w:lvlJc w:val="left"/>
+      <w:pPr>
+        <w:tabs>
+          <w:tab w:val="num" w:pos="2880"/>
+        </w:tabs>
+        <w:ind w:left="2880" w:hanging="360"/>
+      </w:pPr>
+      <w:rPr>
+        <w:rFonts w:ascii="Wingdings" w:hAnsi="Wingdings" w:hint="default"/>
+        <w:sz w:val="20"/>
+      </w:rPr>
+    </w:lvl>
+    <w:lvl w:ilvl="4" w:tentative="1">
+      <w:start w:val="1"/>
+      <w:numFmt w:val="bullet"/>
+      <w:lvlText w:val=""/>
+      <w:lvlJc w:val="left"/>
+      <w:pPr>
+        <w:tabs>
+          <w:tab w:val="num" w:pos="3600"/>
+        </w:tabs>
+        <w:ind w:left="3600" w:hanging="360"/>
+      </w:pPr>
+      <w:rPr>
+        <w:rFonts w:ascii="Wingdings" w:hAnsi="Wingdings" w:hint="default"/>
+        <w:sz w:val="20"/>
+      </w:rPr>
+    </w:lvl>
+    <w:lvl w:ilvl="5" w:tentative="1">
+      <w:start w:val="1"/>
+      <w:numFmt w:val="bullet"/>
+      <w:lvlText w:val=""/>
+      <w:lvlJc w:val="left"/>
+      <w:pPr>
+        <w:tabs>
+          <w:tab w:val="num" w:pos="4320"/>
+        </w:tabs>
+        <w:ind w:left="4320" w:hanging="360"/>
+      </w:pPr>
+      <w:rPr>
+        <w:rFonts w:ascii="Wingdings" w:hAnsi="Wingdings" w:hint="default"/>
+        <w:sz w:val="20"/>
+      </w:rPr>
+    </w:lvl>
+    <w:lvl w:ilvl="6" w:tentative="1">
+      <w:start w:val="1"/>
+      <w:numFmt w:val="bullet"/>
+      <w:lvlText w:val=""/>
+      <w:lvlJc w:val="left"/>
+      <w:pPr>
+        <w:tabs>
+          <w:tab w:val="num" w:pos="5040"/>
+        </w:tabs>
+        <w:ind w:left="5040" w:hanging="360"/>
+      </w:pPr>
+      <w:rPr>
+        <w:rFonts w:ascii="Wingdings" w:hAnsi="Wingdings" w:hint="default"/>
+        <w:sz w:val="20"/>
+      </w:rPr>
+    </w:lvl>
+    <w:lvl w:ilvl="7" w:tentative="1">
+      <w:start w:val="1"/>
+      <w:numFmt w:val="bullet"/>
+      <w:lvlText w:val=""/>
+      <w:lvlJc w:val="left"/>
+      <w:pPr>
+        <w:tabs>
+          <w:tab w:val="num" w:pos="5760"/>
+        </w:tabs>
+        <w:ind w:left="5760" w:hanging="360"/>
+      </w:pPr>
+      <w:rPr>
+        <w:rFonts w:ascii="Wingdings" w:hAnsi="Wingdings" w:hint="default"/>
+        <w:sz w:val="20"/>
+      </w:rPr>
+    </w:lvl>
+    <w:lvl w:ilvl="8" w:tentative="1">
+      <w:start w:val="1"/>
+      <w:numFmt w:val="bullet"/>
+      <w:lvlText w:val=""/>
+      <w:lvlJc w:val="left"/>
+      <w:pPr>
+        <w:tabs>
+          <w:tab w:val="num" w:pos="6480"/>
+        </w:tabs>
+        <w:ind w:left="6480" w:hanging="360"/>
+      </w:pPr>
+      <w:rPr>
+        <w:rFonts w:ascii="Wingdings" w:hAnsi="Wingdings" w:hint="default"/>
+        <w:sz w:val="20"/>
+      </w:rPr>
+    </w:lvl>
+  </w:abstractNum>
+  <w:abstractNum w:abstractNumId="15">
+    <w:nsid w:val="6A564406"/>
+    <w:multiLevelType w:val="multilevel"/>
+    <w:tmpl w:val="DA3A6AEE"/>
+    <w:lvl w:ilvl="0">
+      <w:start w:val="1"/>
+      <w:numFmt w:val="bullet"/>
+      <w:lvlText w:val=""/>
+      <w:lvlJc w:val="left"/>
+      <w:pPr>
+        <w:tabs>
+          <w:tab w:val="num" w:pos="720"/>
+        </w:tabs>
+        <w:ind w:left="720" w:hanging="360"/>
+      </w:pPr>
+      <w:rPr>
+        <w:rFonts w:ascii="Symbol" w:hAnsi="Symbol" w:hint="default"/>
+        <w:sz w:val="20"/>
+      </w:rPr>
+    </w:lvl>
+    <w:lvl w:ilvl="1" w:tentative="1">
+      <w:start w:val="1"/>
+      <w:numFmt w:val="bullet"/>
+      <w:lvlText w:val="o"/>
+      <w:lvlJc w:val="left"/>
+      <w:pPr>
+        <w:tabs>
+          <w:tab w:val="num" w:pos="1440"/>
+        </w:tabs>
+        <w:ind w:left="1440" w:hanging="360"/>
+      </w:pPr>
+      <w:rPr>
+        <w:rFonts w:ascii="Courier New" w:hAnsi="Courier New" w:hint="default"/>
+        <w:sz w:val="20"/>
+      </w:rPr>
+    </w:lvl>
+    <w:lvl w:ilvl="2" w:tentative="1">
+      <w:start w:val="1"/>
+      <w:numFmt w:val="bullet"/>
+      <w:lvlText w:val=""/>
+      <w:lvlJc w:val="left"/>
+      <w:pPr>
+        <w:tabs>
+          <w:tab w:val="num" w:pos="2160"/>
+        </w:tabs>
+        <w:ind w:left="2160" w:hanging="360"/>
+      </w:pPr>
+      <w:rPr>
+        <w:rFonts w:ascii="Wingdings" w:hAnsi="Wingdings" w:hint="default"/>
+        <w:sz w:val="20"/>
+      </w:rPr>
+    </w:lvl>
+    <w:lvl w:ilvl="3" w:tentative="1">
+      <w:start w:val="1"/>
+      <w:numFmt w:val="bullet"/>
+      <w:lvlText w:val=""/>
+      <w:lvlJc w:val="left"/>
+      <w:pPr>
+        <w:tabs>
+          <w:tab w:val="num" w:pos="2880"/>
+        </w:tabs>
+        <w:ind w:left="2880" w:hanging="360"/>
+      </w:pPr>
+      <w:rPr>
+        <w:rFonts w:ascii="Wingdings" w:hAnsi="Wingdings" w:hint="default"/>
+        <w:sz w:val="20"/>
+      </w:rPr>
+    </w:lvl>
+    <w:lvl w:ilvl="4" w:tentative="1">
+      <w:start w:val="1"/>
+      <w:numFmt w:val="bullet"/>
+      <w:lvlText w:val=""/>
+      <w:lvlJc w:val="left"/>
+      <w:pPr>
+        <w:tabs>
+          <w:tab w:val="num" w:pos="3600"/>
+        </w:tabs>
+        <w:ind w:left="3600" w:hanging="360"/>
+      </w:pPr>
+      <w:rPr>
+        <w:rFonts w:ascii="Wingdings" w:hAnsi="Wingdings" w:hint="default"/>
+        <w:sz w:val="20"/>
+      </w:rPr>
+    </w:lvl>
+    <w:lvl w:ilvl="5" w:tentative="1">
+      <w:start w:val="1"/>
+      <w:numFmt w:val="bullet"/>
+      <w:lvlText w:val=""/>
+      <w:lvlJc w:val="left"/>
+      <w:pPr>
+        <w:tabs>
+          <w:tab w:val="num" w:pos="4320"/>
+        </w:tabs>
+        <w:ind w:left="4320" w:hanging="360"/>
+      </w:pPr>
+      <w:rPr>
+        <w:rFonts w:ascii="Wingdings" w:hAnsi="Wingdings" w:hint="default"/>
+        <w:sz w:val="20"/>
+      </w:rPr>
+    </w:lvl>
+    <w:lvl w:ilvl="6" w:tentative="1">
+      <w:start w:val="1"/>
+      <w:numFmt w:val="bullet"/>
+      <w:lvlText w:val=""/>
+      <w:lvlJc w:val="left"/>
+      <w:pPr>
+        <w:tabs>
+          <w:tab w:val="num" w:pos="5040"/>
+        </w:tabs>
+        <w:ind w:left="5040" w:hanging="360"/>
+      </w:pPr>
+      <w:rPr>
+        <w:rFonts w:ascii="Wingdings" w:hAnsi="Wingdings" w:hint="default"/>
+        <w:sz w:val="20"/>
+      </w:rPr>
+    </w:lvl>
+    <w:lvl w:ilvl="7" w:tentative="1">
+      <w:start w:val="1"/>
+      <w:numFmt w:val="bullet"/>
+      <w:lvlText w:val=""/>
+      <w:lvlJc w:val="left"/>
+      <w:pPr>
+        <w:tabs>
+          <w:tab w:val="num" w:pos="5760"/>
+        </w:tabs>
+        <w:ind w:left="5760" w:hanging="360"/>
+      </w:pPr>
+      <w:rPr>
+        <w:rFonts w:ascii="Wingdings" w:hAnsi="Wingdings" w:hint="default"/>
+        <w:sz w:val="20"/>
+      </w:rPr>
+    </w:lvl>
+    <w:lvl w:ilvl="8" w:tentative="1">
+      <w:start w:val="1"/>
+      <w:numFmt w:val="bullet"/>
+      <w:lvlText w:val=""/>
+      <w:lvlJc w:val="left"/>
+      <w:pPr>
+        <w:tabs>
+          <w:tab w:val="num" w:pos="6480"/>
+        </w:tabs>
+        <w:ind w:left="6480" w:hanging="360"/>
+      </w:pPr>
+      <w:rPr>
+        <w:rFonts w:ascii="Wingdings" w:hAnsi="Wingdings" w:hint="default"/>
+        <w:sz w:val="20"/>
+      </w:rPr>
+    </w:lvl>
+  </w:abstractNum>
   <w:num w:numId="1">
+    <w:abstractNumId w:val="5"/>
+  </w:num>
+  <w:num w:numId="2">
+    <w:abstractNumId w:val="11"/>
+  </w:num>
+  <w:num w:numId="3">
+    <w:abstractNumId w:val="13"/>
+  </w:num>
+  <w:num w:numId="4">
+    <w:abstractNumId w:val="6"/>
+  </w:num>
+  <w:num w:numId="5">
+    <w:abstractNumId w:val="14"/>
+  </w:num>
+  <w:num w:numId="6">
+    <w:abstractNumId w:val="9"/>
+  </w:num>
+  <w:num w:numId="7">
+    <w:abstractNumId w:val="2"/>
+  </w:num>
+  <w:num w:numId="8">
     <w:abstractNumId w:val="0"/>
   </w:num>
-  <w:num w:numId="2">
+  <w:num w:numId="9">
+    <w:abstractNumId w:val="7"/>
+  </w:num>
+  <w:num w:numId="10">
+    <w:abstractNumId w:val="15"/>
+  </w:num>
+  <w:num w:numId="11">
+    <w:abstractNumId w:val="3"/>
+  </w:num>
+  <w:num w:numId="12">
     <w:abstractNumId w:val="1"/>
   </w:num>
-  <w:num w:numId="3">
-    <w:abstractNumId w:val="2"/>
+  <w:num w:numId="13">
+    <w:abstractNumId w:val="10"/>
+  </w:num>
+  <w:num w:numId="14">
+    <w:abstractNumId w:val="12"/>
+  </w:num>
+  <w:num w:numId="15">
+    <w:abstractNumId w:val="8"/>
+  </w:num>
+  <w:num w:numId="16">
+    <w:abstractNumId w:val="4"/>
   </w:num>
 </w:numbering>
 </file>
@@ -3061,6 +5004,36 @@
       <w:szCs w:val="28"/>
     </w:rPr>
   </w:style>
+  <w:style w:type="character" w:customStyle="1" w:styleId="m">
+    <w:name w:val="ͼm"/>
+    <w:basedOn w:val="DefaultParagraphFont"/>
+    <w:rsid w:val="00BB29AC"/>
+  </w:style>
+  <w:style w:type="character" w:customStyle="1" w:styleId="g">
+    <w:name w:val="ͼg"/>
+    <w:basedOn w:val="DefaultParagraphFont"/>
+    <w:rsid w:val="00BB29AC"/>
+  </w:style>
+  <w:style w:type="character" w:customStyle="1" w:styleId="j">
+    <w:name w:val="ͼj"/>
+    <w:basedOn w:val="DefaultParagraphFont"/>
+    <w:rsid w:val="00BB29AC"/>
+  </w:style>
+  <w:style w:type="character" w:customStyle="1" w:styleId="o">
+    <w:name w:val="ͼo"/>
+    <w:basedOn w:val="DefaultParagraphFont"/>
+    <w:rsid w:val="00BB29AC"/>
+  </w:style>
+  <w:style w:type="character" w:customStyle="1" w:styleId="n">
+    <w:name w:val="ͼn"/>
+    <w:basedOn w:val="DefaultParagraphFont"/>
+    <w:rsid w:val="00BB29AC"/>
+  </w:style>
+  <w:style w:type="character" w:customStyle="1" w:styleId="k">
+    <w:name w:val="ͼk"/>
+    <w:basedOn w:val="DefaultParagraphFont"/>
+    <w:rsid w:val="00BB29AC"/>
+  </w:style>
 </w:styles>
 </file>
 
@@ -3463,6 +5436,36 @@
       <w:szCs w:val="28"/>
     </w:rPr>
   </w:style>
+  <w:style w:type="character" w:customStyle="1" w:styleId="m">
+    <w:name w:val="ͼm"/>
+    <w:basedOn w:val="DefaultParagraphFont"/>
+    <w:rsid w:val="00BB29AC"/>
+  </w:style>
+  <w:style w:type="character" w:customStyle="1" w:styleId="g">
+    <w:name w:val="ͼg"/>
+    <w:basedOn w:val="DefaultParagraphFont"/>
+    <w:rsid w:val="00BB29AC"/>
+  </w:style>
+  <w:style w:type="character" w:customStyle="1" w:styleId="j">
+    <w:name w:val="ͼj"/>
+    <w:basedOn w:val="DefaultParagraphFont"/>
+    <w:rsid w:val="00BB29AC"/>
+  </w:style>
+  <w:style w:type="character" w:customStyle="1" w:styleId="o">
+    <w:name w:val="ͼo"/>
+    <w:basedOn w:val="DefaultParagraphFont"/>
+    <w:rsid w:val="00BB29AC"/>
+  </w:style>
+  <w:style w:type="character" w:customStyle="1" w:styleId="n">
+    <w:name w:val="ͼn"/>
+    <w:basedOn w:val="DefaultParagraphFont"/>
+    <w:rsid w:val="00BB29AC"/>
+  </w:style>
+  <w:style w:type="character" w:customStyle="1" w:styleId="k">
+    <w:name w:val="ͼk"/>
+    <w:basedOn w:val="DefaultParagraphFont"/>
+    <w:rsid w:val="00BB29AC"/>
+  </w:style>
 </w:styles>
 </file>
 

</xml_diff>